<commit_message>
updated to new version
</commit_message>
<xml_diff>
--- a/docs/lehrmaterialien/math_02_negative_zahlen/math_02_negative_zahlen.docx
+++ b/docs/lehrmaterialien/math_02_negative_zahlen/math_02_negative_zahlen.docx
@@ -7,13 +7,7 @@
         <w:pStyle w:val="Title"/>
       </w:pPr>
       <w:r>
-        <w:t xml:space="preserve">Negative</w:t>
-      </w:r>
-      <w:r>
-        <w:t xml:space="preserve"> </w:t>
-      </w:r>
-      <w:r>
-        <w:t xml:space="preserve">Zahlen</w:t>
+        <w:t xml:space="preserve">Negative Zahlen</w:t>
       </w:r>
     </w:p>
     <w:p>
@@ -21,31 +15,7 @@
         <w:pStyle w:val="Subtitle"/>
       </w:pPr>
       <w:r>
-        <w:t xml:space="preserve">Addition,</w:t>
-      </w:r>
-      <w:r>
-        <w:t xml:space="preserve"> </w:t>
-      </w:r>
-      <w:r>
-        <w:t xml:space="preserve">Subtraktion,</w:t>
-      </w:r>
-      <w:r>
-        <w:t xml:space="preserve"> </w:t>
-      </w:r>
-      <w:r>
-        <w:t xml:space="preserve">Multiplikation</w:t>
-      </w:r>
-      <w:r>
-        <w:t xml:space="preserve"> </w:t>
-      </w:r>
-      <w:r>
-        <w:t xml:space="preserve">und</w:t>
-      </w:r>
-      <w:r>
-        <w:t xml:space="preserve"> </w:t>
-      </w:r>
-      <w:r>
-        <w:t xml:space="preserve">Division</w:t>
+        <w:t xml:space="preserve">Addition, Subtraktion, Multiplikation und Division</w:t>
       </w:r>
     </w:p>
     <w:p>
@@ -53,13 +23,7 @@
         <w:pStyle w:val="Author"/>
       </w:pPr>
       <w:r>
-        <w:t xml:space="preserve">Richard</w:t>
-      </w:r>
-      <w:r>
-        <w:t xml:space="preserve"> </w:t>
-      </w:r>
-      <w:r>
-        <w:t xml:space="preserve">Conrardy</w:t>
+        <w:t xml:space="preserve">Richard Conrardy</w:t>
       </w:r>
     </w:p>
     <w:p>
@@ -83,139 +47,7 @@
         <w:pStyle w:val="Abstract"/>
       </w:pPr>
       <w:r>
-        <w:t xml:space="preserve">Zwei</w:t>
-      </w:r>
-      <w:r>
-        <w:t xml:space="preserve"> </w:t>
-      </w:r>
-      <w:r>
-        <w:t xml:space="preserve">Doppellektionen</w:t>
-      </w:r>
-      <w:r>
-        <w:t xml:space="preserve"> </w:t>
-      </w:r>
-      <w:r>
-        <w:t xml:space="preserve">zum</w:t>
-      </w:r>
-      <w:r>
-        <w:t xml:space="preserve"> </w:t>
-      </w:r>
-      <w:r>
-        <w:t xml:space="preserve">Rechnen</w:t>
-      </w:r>
-      <w:r>
-        <w:t xml:space="preserve"> </w:t>
-      </w:r>
-      <w:r>
-        <w:t xml:space="preserve">mit</w:t>
-      </w:r>
-      <w:r>
-        <w:t xml:space="preserve"> </w:t>
-      </w:r>
-      <w:r>
-        <w:t xml:space="preserve">negativen</w:t>
-      </w:r>
-      <w:r>
-        <w:t xml:space="preserve"> </w:t>
-      </w:r>
-      <w:r>
-        <w:t xml:space="preserve">Zahlen</w:t>
-      </w:r>
-      <w:r>
-        <w:t xml:space="preserve"> </w:t>
-      </w:r>
-      <w:r>
-        <w:t xml:space="preserve">(Addition,</w:t>
-      </w:r>
-      <w:r>
-        <w:t xml:space="preserve"> </w:t>
-      </w:r>
-      <w:r>
-        <w:t xml:space="preserve">Subtraktion,</w:t>
-      </w:r>
-      <w:r>
-        <w:t xml:space="preserve"> </w:t>
-      </w:r>
-      <w:r>
-        <w:t xml:space="preserve">Multiplikation</w:t>
-      </w:r>
-      <w:r>
-        <w:t xml:space="preserve"> </w:t>
-      </w:r>
-      <w:r>
-        <w:t xml:space="preserve">und</w:t>
-      </w:r>
-      <w:r>
-        <w:t xml:space="preserve"> </w:t>
-      </w:r>
-      <w:r>
-        <w:t xml:space="preserve">Division)</w:t>
-      </w:r>
-      <w:r>
-        <w:t xml:space="preserve"> </w:t>
-      </w:r>
-      <w:r>
-        <w:t xml:space="preserve">mit</w:t>
-      </w:r>
-      <w:r>
-        <w:t xml:space="preserve"> </w:t>
-      </w:r>
-      <w:r>
-        <w:t xml:space="preserve">einer</w:t>
-      </w:r>
-      <w:r>
-        <w:t xml:space="preserve"> </w:t>
-      </w:r>
-      <w:r>
-        <w:t xml:space="preserve">Mischung</w:t>
-      </w:r>
-      <w:r>
-        <w:t xml:space="preserve"> </w:t>
-      </w:r>
-      <w:r>
-        <w:t xml:space="preserve">aus</w:t>
-      </w:r>
-      <w:r>
-        <w:t xml:space="preserve"> </w:t>
-      </w:r>
-      <w:r>
-        <w:t xml:space="preserve">LP-Erklärungen</w:t>
-      </w:r>
-      <w:r>
-        <w:t xml:space="preserve"> </w:t>
-      </w:r>
-      <w:r>
-        <w:t xml:space="preserve">und</w:t>
-      </w:r>
-      <w:r>
-        <w:t xml:space="preserve"> </w:t>
-      </w:r>
-      <w:r>
-        <w:t xml:space="preserve">Gruppenaufgaben</w:t>
-      </w:r>
-      <w:r>
-        <w:t xml:space="preserve"> </w:t>
-      </w:r>
-      <w:r>
-        <w:t xml:space="preserve">sowie</w:t>
-      </w:r>
-      <w:r>
-        <w:t xml:space="preserve"> </w:t>
-      </w:r>
-      <w:r>
-        <w:t xml:space="preserve">einem</w:t>
-      </w:r>
-      <w:r>
-        <w:t xml:space="preserve"> </w:t>
-      </w:r>
-      <w:r>
-        <w:t xml:space="preserve">unterrichtsbegleitenden</w:t>
-      </w:r>
-      <w:r>
-        <w:t xml:space="preserve"> </w:t>
-      </w:r>
-      <w:r>
-        <w:t xml:space="preserve">Skript.</w:t>
+        <w:t xml:space="preserve">Zwei Doppellektionen zum Rechnen mit negativen Zahlen (Addition, Subtraktion, Multiplikation und Division) mit einer Mischung aus LP-Erklärungen und Gruppenaufgaben sowie einem unterrichtsbegleitenden Skript.</w:t>
       </w:r>
     </w:p>
     <w:sdt>
@@ -368,11 +200,11 @@
           </w:p>
           <w:p>
             <w:pPr>
+              <w:pStyle w:val="Compact"/>
               <w:numPr>
                 <w:ilvl w:val="0"/>
                 <w:numId w:val="1001"/>
               </w:numPr>
-              <w:pStyle w:val="Compact"/>
             </w:pPr>
             <w:r>
               <w:t xml:space="preserve">wenden die negativen Zahlen in einem realen Kontext an, z.B. bei Temperaturangaben auf dem Thermometer ablesen.</w:t>
@@ -380,11 +212,11 @@
           </w:p>
           <w:p>
             <w:pPr>
+              <w:pStyle w:val="Compact"/>
               <w:numPr>
                 <w:ilvl w:val="0"/>
                 <w:numId w:val="1001"/>
               </w:numPr>
-              <w:pStyle w:val="Compact"/>
             </w:pPr>
             <w:r>
               <w:t xml:space="preserve">vergleichen negative Zahlen mit positiven Zahlen und tragen sie auf der Zahlengerade richtig ein.</w:t>
@@ -392,11 +224,11 @@
           </w:p>
           <w:p>
             <w:pPr>
+              <w:pStyle w:val="Compact"/>
               <w:numPr>
                 <w:ilvl w:val="0"/>
                 <w:numId w:val="1001"/>
               </w:numPr>
-              <w:pStyle w:val="Compact"/>
             </w:pPr>
             <w:r>
               <w:t xml:space="preserve">führen die Grundoperationen (Addition, Subtraktion, Multiplikation und Division) mit negativen Zahlen korrekt aus</w:t>
@@ -537,8 +369,8 @@
       </w:pPr>
       <w:r>
         <w:rPr>
+          <w:b/>
           <w:bCs/>
-          <w:b/>
         </w:rPr>
         <w:t xml:space="preserve">Übungsaufgabe 1 (Thermometer)</w:t>
       </w:r>
@@ -556,11 +388,11 @@
     </w:p>
     <w:p>
       <w:pPr>
+        <w:pStyle w:val="Compact"/>
         <w:numPr>
           <w:ilvl w:val="0"/>
           <w:numId w:val="1002"/>
         </w:numPr>
-        <w:pStyle w:val="Compact"/>
       </w:pPr>
       <w:r>
         <w:t xml:space="preserve">Die Temperatur beträgt am frühen Morgen -3°C. Im Laufe des Tages steigt die Temperatur um 6°C.</w:t>
@@ -568,11 +400,11 @@
     </w:p>
     <w:p>
       <w:pPr>
+        <w:pStyle w:val="Compact"/>
         <w:numPr>
           <w:ilvl w:val="1"/>
           <w:numId w:val="1003"/>
         </w:numPr>
-        <w:pStyle w:val="Compact"/>
       </w:pPr>
       <w:r>
         <w:t xml:space="preserve">Frage: Welche Temperatur herrscht am Abend?</w:t>
@@ -580,11 +412,11 @@
     </w:p>
     <w:p>
       <w:pPr>
+        <w:pStyle w:val="Compact"/>
         <w:numPr>
           <w:ilvl w:val="0"/>
           <w:numId w:val="1002"/>
         </w:numPr>
-        <w:pStyle w:val="Compact"/>
       </w:pPr>
       <w:r>
         <w:t xml:space="preserve">Am Abend beträgt die Temperatur −2° Über Nacht sinkt die Temperatur um 5°C.</w:t>
@@ -592,11 +424,11 @@
     </w:p>
     <w:p>
       <w:pPr>
+        <w:pStyle w:val="Compact"/>
         <w:numPr>
           <w:ilvl w:val="1"/>
           <w:numId w:val="1004"/>
         </w:numPr>
-        <w:pStyle w:val="Compact"/>
       </w:pPr>
       <w:r>
         <w:t xml:space="preserve">Frage: Wie warm ist es am nächsten Morgen?</w:t>
@@ -604,11 +436,11 @@
     </w:p>
     <w:p>
       <w:pPr>
+        <w:pStyle w:val="Compact"/>
         <w:numPr>
           <w:ilvl w:val="0"/>
           <w:numId w:val="1002"/>
         </w:numPr>
-        <w:pStyle w:val="Compact"/>
       </w:pPr>
       <w:r>
         <w:t xml:space="preserve">Die Temperatur in Stadt A beträgt −8°C, und in Stadt B beträgt sie 2°C.</w:t>
@@ -616,11 +448,11 @@
     </w:p>
     <w:p>
       <w:pPr>
+        <w:pStyle w:val="Compact"/>
         <w:numPr>
           <w:ilvl w:val="1"/>
           <w:numId w:val="1005"/>
         </w:numPr>
-        <w:pStyle w:val="Compact"/>
       </w:pPr>
       <w:r>
         <w:t xml:space="preserve">Frage: Wie viel kälter ist es in Stadt A als in Stadt B?</w:t>
@@ -847,8 +679,8 @@
             </w:r>
             <w:r>
               <w:rPr>
+                <w:b/>
                 <w:bCs/>
-                <w:b/>
               </w:rPr>
               <w:t xml:space="preserve">Induktives Vorgehen</w:t>
             </w:r>
@@ -890,8 +722,8 @@
             </w:r>
             <w:r>
               <w:rPr>
+                <w:b/>
                 <w:bCs/>
-                <w:b/>
               </w:rPr>
               <w:t xml:space="preserve">Deduktives Vorgehen</w:t>
             </w:r>
@@ -1283,8 +1115,8 @@
       </w:pPr>
       <w:r>
         <w:rPr>
+          <w:b/>
           <w:bCs/>
-          <w:b/>
         </w:rPr>
         <w:t xml:space="preserve">Übungsaufgabe 2 (Übungsaufgaben Addition und Subtraktion)</w:t>
       </w:r>
@@ -1297,11 +1129,11 @@
     </w:p>
     <w:p>
       <w:pPr>
+        <w:pStyle w:val="Compact"/>
         <w:numPr>
           <w:ilvl w:val="0"/>
           <w:numId w:val="1006"/>
         </w:numPr>
-        <w:pStyle w:val="Compact"/>
       </w:pPr>
       <m:oMath>
         <m:r>
@@ -1348,11 +1180,11 @@
     </w:p>
     <w:p>
       <w:pPr>
+        <w:pStyle w:val="Compact"/>
         <w:numPr>
           <w:ilvl w:val="0"/>
           <w:numId w:val="1006"/>
         </w:numPr>
-        <w:pStyle w:val="Compact"/>
       </w:pPr>
       <m:oMath>
         <m:r>
@@ -1383,11 +1215,11 @@
     </w:p>
     <w:p>
       <w:pPr>
+        <w:pStyle w:val="Compact"/>
         <w:numPr>
           <w:ilvl w:val="0"/>
           <w:numId w:val="1006"/>
         </w:numPr>
-        <w:pStyle w:val="Compact"/>
       </w:pPr>
       <m:oMath>
         <m:r>
@@ -1434,11 +1266,11 @@
     </w:p>
     <w:p>
       <w:pPr>
+        <w:pStyle w:val="Compact"/>
         <w:numPr>
           <w:ilvl w:val="0"/>
           <w:numId w:val="1006"/>
         </w:numPr>
-        <w:pStyle w:val="Compact"/>
       </w:pPr>
       <m:oMath>
         <m:r>
@@ -1463,11 +1295,11 @@
     </w:p>
     <w:p>
       <w:pPr>
+        <w:pStyle w:val="Compact"/>
         <w:numPr>
           <w:ilvl w:val="0"/>
           <w:numId w:val="1006"/>
         </w:numPr>
-        <w:pStyle w:val="Compact"/>
       </w:pPr>
       <m:oMath>
         <m:r>
@@ -1508,11 +1340,11 @@
     </w:p>
     <w:p>
       <w:pPr>
+        <w:pStyle w:val="Compact"/>
         <w:numPr>
           <w:ilvl w:val="0"/>
           <w:numId w:val="1006"/>
         </w:numPr>
-        <w:pStyle w:val="Compact"/>
       </w:pPr>
       <m:oMath>
         <m:r>
@@ -1553,11 +1385,11 @@
     </w:p>
     <w:p>
       <w:pPr>
+        <w:pStyle w:val="Compact"/>
         <w:numPr>
           <w:ilvl w:val="0"/>
           <w:numId w:val="1006"/>
         </w:numPr>
-        <w:pStyle w:val="Compact"/>
       </w:pPr>
       <m:oMath>
         <m:r>
@@ -1598,11 +1430,11 @@
     </w:p>
     <w:p>
       <w:pPr>
+        <w:pStyle w:val="Compact"/>
         <w:numPr>
           <w:ilvl w:val="0"/>
           <w:numId w:val="1006"/>
         </w:numPr>
-        <w:pStyle w:val="Compact"/>
       </w:pPr>
       <m:oMath>
         <m:r>
@@ -1649,11 +1481,11 @@
     </w:p>
     <w:p>
       <w:pPr>
+        <w:pStyle w:val="Compact"/>
         <w:numPr>
           <w:ilvl w:val="0"/>
           <w:numId w:val="1006"/>
         </w:numPr>
-        <w:pStyle w:val="Compact"/>
       </w:pPr>
       <m:oMath>
         <m:r>
@@ -1700,11 +1532,11 @@
     </w:p>
     <w:p>
       <w:pPr>
+        <w:pStyle w:val="Compact"/>
         <w:numPr>
           <w:ilvl w:val="0"/>
           <w:numId w:val="1006"/>
         </w:numPr>
-        <w:pStyle w:val="Compact"/>
       </w:pPr>
       <m:oMath>
         <m:r>
@@ -1745,11 +1577,11 @@
     </w:p>
     <w:p>
       <w:pPr>
+        <w:pStyle w:val="Compact"/>
         <w:numPr>
           <w:ilvl w:val="0"/>
           <w:numId w:val="1006"/>
         </w:numPr>
-        <w:pStyle w:val="Compact"/>
       </w:pPr>
       <m:oMath>
         <m:r>
@@ -1774,11 +1606,11 @@
     </w:p>
     <w:p>
       <w:pPr>
+        <w:pStyle w:val="Compact"/>
         <w:numPr>
           <w:ilvl w:val="0"/>
           <w:numId w:val="1006"/>
         </w:numPr>
-        <w:pStyle w:val="Compact"/>
       </w:pPr>
       <m:oMath>
         <m:r>
@@ -1803,11 +1635,11 @@
     </w:p>
     <w:p>
       <w:pPr>
+        <w:pStyle w:val="Compact"/>
         <w:numPr>
           <w:ilvl w:val="0"/>
           <w:numId w:val="1006"/>
         </w:numPr>
-        <w:pStyle w:val="Compact"/>
       </w:pPr>
       <m:oMath>
         <m:r>
@@ -1838,11 +1670,11 @@
     </w:p>
     <w:p>
       <w:pPr>
+        <w:pStyle w:val="Compact"/>
         <w:numPr>
           <w:ilvl w:val="0"/>
           <w:numId w:val="1006"/>
         </w:numPr>
-        <w:pStyle w:val="Compact"/>
       </w:pPr>
       <m:oMath>
         <m:r>
@@ -1889,11 +1721,11 @@
     </w:p>
     <w:p>
       <w:pPr>
+        <w:pStyle w:val="Compact"/>
         <w:numPr>
           <w:ilvl w:val="0"/>
           <w:numId w:val="1006"/>
         </w:numPr>
-        <w:pStyle w:val="Compact"/>
       </w:pPr>
       <m:oMath>
         <m:r>
@@ -1918,11 +1750,11 @@
     </w:p>
     <w:p>
       <w:pPr>
+        <w:pStyle w:val="Compact"/>
         <w:numPr>
           <w:ilvl w:val="0"/>
           <w:numId w:val="1006"/>
         </w:numPr>
-        <w:pStyle w:val="Compact"/>
       </w:pPr>
       <m:oMath>
         <m:r>
@@ -1947,11 +1779,11 @@
     </w:p>
     <w:p>
       <w:pPr>
+        <w:pStyle w:val="Compact"/>
         <w:numPr>
           <w:ilvl w:val="0"/>
           <w:numId w:val="1006"/>
         </w:numPr>
-        <w:pStyle w:val="Compact"/>
       </w:pPr>
       <m:oMath>
         <m:r>
@@ -1982,11 +1814,11 @@
     </w:p>
     <w:p>
       <w:pPr>
+        <w:pStyle w:val="Compact"/>
         <w:numPr>
           <w:ilvl w:val="0"/>
           <w:numId w:val="1006"/>
         </w:numPr>
-        <w:pStyle w:val="Compact"/>
       </w:pPr>
       <m:oMath>
         <m:r>
@@ -2027,11 +1859,11 @@
     </w:p>
     <w:p>
       <w:pPr>
+        <w:pStyle w:val="Compact"/>
         <w:numPr>
           <w:ilvl w:val="0"/>
           <w:numId w:val="1006"/>
         </w:numPr>
-        <w:pStyle w:val="Compact"/>
       </w:pPr>
       <m:oMath>
         <m:r>
@@ -2078,11 +1910,11 @@
     </w:p>
     <w:p>
       <w:pPr>
+        <w:pStyle w:val="Compact"/>
         <w:numPr>
           <w:ilvl w:val="0"/>
           <w:numId w:val="1006"/>
         </w:numPr>
-        <w:pStyle w:val="Compact"/>
       </w:pPr>
       <m:oMath>
         <m:r>
@@ -2107,11 +1939,11 @@
     </w:p>
     <w:p>
       <w:pPr>
+        <w:pStyle w:val="Compact"/>
         <w:numPr>
           <w:ilvl w:val="0"/>
           <w:numId w:val="1006"/>
         </w:numPr>
-        <w:pStyle w:val="Compact"/>
       </w:pPr>
       <m:oMath>
         <m:r>
@@ -2152,11 +1984,11 @@
     </w:p>
     <w:p>
       <w:pPr>
+        <w:pStyle w:val="Compact"/>
         <w:numPr>
           <w:ilvl w:val="0"/>
           <w:numId w:val="1006"/>
         </w:numPr>
-        <w:pStyle w:val="Compact"/>
       </w:pPr>
       <m:oMath>
         <m:r>
@@ -2181,11 +2013,11 @@
     </w:p>
     <w:p>
       <w:pPr>
+        <w:pStyle w:val="Compact"/>
         <w:numPr>
           <w:ilvl w:val="0"/>
           <w:numId w:val="1006"/>
         </w:numPr>
-        <w:pStyle w:val="Compact"/>
       </w:pPr>
       <m:oMath>
         <m:r>
@@ -2226,11 +2058,11 @@
     </w:p>
     <w:p>
       <w:pPr>
+        <w:pStyle w:val="Compact"/>
         <w:numPr>
           <w:ilvl w:val="0"/>
           <w:numId w:val="1006"/>
         </w:numPr>
-        <w:pStyle w:val="Compact"/>
       </w:pPr>
       <m:oMath>
         <m:r>
@@ -2271,11 +2103,11 @@
     </w:p>
     <w:p>
       <w:pPr>
+        <w:pStyle w:val="Compact"/>
         <w:numPr>
           <w:ilvl w:val="0"/>
           <w:numId w:val="1006"/>
         </w:numPr>
-        <w:pStyle w:val="Compact"/>
       </w:pPr>
       <m:oMath>
         <m:r>
@@ -2322,11 +2154,11 @@
     </w:p>
     <w:p>
       <w:pPr>
+        <w:pStyle w:val="Compact"/>
         <w:numPr>
           <w:ilvl w:val="0"/>
           <w:numId w:val="1006"/>
         </w:numPr>
-        <w:pStyle w:val="Compact"/>
       </w:pPr>
       <m:oMath>
         <m:r>
@@ -2367,11 +2199,11 @@
     </w:p>
     <w:p>
       <w:pPr>
+        <w:pStyle w:val="Compact"/>
         <w:numPr>
           <w:ilvl w:val="0"/>
           <w:numId w:val="1006"/>
         </w:numPr>
-        <w:pStyle w:val="Compact"/>
       </w:pPr>
       <m:oMath>
         <m:r>
@@ -2418,11 +2250,11 @@
     </w:p>
     <w:p>
       <w:pPr>
+        <w:pStyle w:val="Compact"/>
         <w:numPr>
           <w:ilvl w:val="0"/>
           <w:numId w:val="1006"/>
         </w:numPr>
-        <w:pStyle w:val="Compact"/>
       </w:pPr>
       <m:oMath>
         <m:r>
@@ -2447,11 +2279,11 @@
     </w:p>
     <w:p>
       <w:pPr>
+        <w:pStyle w:val="Compact"/>
         <w:numPr>
           <w:ilvl w:val="0"/>
           <w:numId w:val="1006"/>
         </w:numPr>
-        <w:pStyle w:val="Compact"/>
       </w:pPr>
       <m:oMath>
         <m:r>
@@ -2498,11 +2330,11 @@
     </w:p>
     <w:p>
       <w:pPr>
+        <w:pStyle w:val="Compact"/>
         <w:numPr>
           <w:ilvl w:val="0"/>
           <w:numId w:val="1006"/>
         </w:numPr>
-        <w:pStyle w:val="Compact"/>
       </w:pPr>
       <m:oMath>
         <m:r>
@@ -2940,8 +2772,8 @@
       </w:pPr>
       <w:r>
         <w:rPr>
+          <w:b/>
           <w:bCs/>
-          <w:b/>
         </w:rPr>
         <w:t xml:space="preserve">Übungsaufgabe 3 (Übungsaufgaben Multiplikation und Division (15 Min.))</w:t>
       </w:r>
@@ -2954,11 +2786,11 @@
     </w:p>
     <w:p>
       <w:pPr>
+        <w:pStyle w:val="Compact"/>
         <w:numPr>
           <w:ilvl w:val="0"/>
           <w:numId w:val="1007"/>
         </w:numPr>
-        <w:pStyle w:val="Compact"/>
       </w:pPr>
       <m:oMath>
         <m:r>
@@ -2989,11 +2821,11 @@
     </w:p>
     <w:p>
       <w:pPr>
+        <w:pStyle w:val="Compact"/>
         <w:numPr>
           <w:ilvl w:val="0"/>
           <w:numId w:val="1007"/>
         </w:numPr>
-        <w:pStyle w:val="Compact"/>
       </w:pPr>
       <m:oMath>
         <m:r>
@@ -3024,11 +2856,11 @@
     </w:p>
     <w:p>
       <w:pPr>
+        <w:pStyle w:val="Compact"/>
         <w:numPr>
           <w:ilvl w:val="0"/>
           <w:numId w:val="1007"/>
         </w:numPr>
-        <w:pStyle w:val="Compact"/>
       </w:pPr>
       <m:oMath>
         <m:r>
@@ -3069,11 +2901,11 @@
     </w:p>
     <w:p>
       <w:pPr>
+        <w:pStyle w:val="Compact"/>
         <w:numPr>
           <w:ilvl w:val="0"/>
           <w:numId w:val="1007"/>
         </w:numPr>
-        <w:pStyle w:val="Compact"/>
       </w:pPr>
       <m:oMath>
         <m:r>
@@ -3120,11 +2952,11 @@
     </w:p>
     <w:p>
       <w:pPr>
+        <w:pStyle w:val="Compact"/>
         <w:numPr>
           <w:ilvl w:val="0"/>
           <w:numId w:val="1007"/>
         </w:numPr>
-        <w:pStyle w:val="Compact"/>
       </w:pPr>
       <m:oMath>
         <m:r>
@@ -3171,11 +3003,11 @@
     </w:p>
     <w:p>
       <w:pPr>
+        <w:pStyle w:val="Compact"/>
         <w:numPr>
           <w:ilvl w:val="0"/>
           <w:numId w:val="1007"/>
         </w:numPr>
-        <w:pStyle w:val="Compact"/>
       </w:pPr>
       <m:oMath>
         <m:r>
@@ -3216,11 +3048,11 @@
     </w:p>
     <w:p>
       <w:pPr>
+        <w:pStyle w:val="Compact"/>
         <w:numPr>
           <w:ilvl w:val="0"/>
           <w:numId w:val="1007"/>
         </w:numPr>
-        <w:pStyle w:val="Compact"/>
       </w:pPr>
       <m:oMath>
         <m:r>
@@ -3251,11 +3083,11 @@
     </w:p>
     <w:p>
       <w:pPr>
+        <w:pStyle w:val="Compact"/>
         <w:numPr>
           <w:ilvl w:val="0"/>
           <w:numId w:val="1007"/>
         </w:numPr>
-        <w:pStyle w:val="Compact"/>
       </w:pPr>
       <m:oMath>
         <m:r>
@@ -3286,11 +3118,11 @@
     </w:p>
     <w:p>
       <w:pPr>
+        <w:pStyle w:val="Compact"/>
         <w:numPr>
           <w:ilvl w:val="0"/>
           <w:numId w:val="1007"/>
         </w:numPr>
-        <w:pStyle w:val="Compact"/>
       </w:pPr>
       <m:oMath>
         <m:r>
@@ -3337,11 +3169,11 @@
     </w:p>
     <w:p>
       <w:pPr>
+        <w:pStyle w:val="Compact"/>
         <w:numPr>
           <w:ilvl w:val="0"/>
           <w:numId w:val="1007"/>
         </w:numPr>
-        <w:pStyle w:val="Compact"/>
       </w:pPr>
       <m:oMath>
         <m:r>
@@ -3382,11 +3214,11 @@
     </w:p>
     <w:p>
       <w:pPr>
+        <w:pStyle w:val="Compact"/>
         <w:numPr>
           <w:ilvl w:val="0"/>
           <w:numId w:val="1007"/>
         </w:numPr>
-        <w:pStyle w:val="Compact"/>
       </w:pPr>
       <m:oMath>
         <m:r>
@@ -3417,11 +3249,11 @@
     </w:p>
     <w:p>
       <w:pPr>
+        <w:pStyle w:val="Compact"/>
         <w:numPr>
           <w:ilvl w:val="0"/>
           <w:numId w:val="1007"/>
         </w:numPr>
-        <w:pStyle w:val="Compact"/>
       </w:pPr>
       <m:oMath>
         <m:r>
@@ -3462,11 +3294,11 @@
     </w:p>
     <w:p>
       <w:pPr>
+        <w:pStyle w:val="Compact"/>
         <w:numPr>
           <w:ilvl w:val="0"/>
           <w:numId w:val="1007"/>
         </w:numPr>
-        <w:pStyle w:val="Compact"/>
       </w:pPr>
       <m:oMath>
         <m:r>
@@ -3513,11 +3345,11 @@
     </w:p>
     <w:p>
       <w:pPr>
+        <w:pStyle w:val="Compact"/>
         <w:numPr>
           <w:ilvl w:val="0"/>
           <w:numId w:val="1007"/>
         </w:numPr>
-        <w:pStyle w:val="Compact"/>
       </w:pPr>
       <m:oMath>
         <m:r>
@@ -3548,11 +3380,11 @@
     </w:p>
     <w:p>
       <w:pPr>
+        <w:pStyle w:val="Compact"/>
         <w:numPr>
           <w:ilvl w:val="0"/>
           <w:numId w:val="1007"/>
         </w:numPr>
-        <w:pStyle w:val="Compact"/>
       </w:pPr>
       <m:oMath>
         <m:r>
@@ -3599,11 +3431,11 @@
     </w:p>
     <w:p>
       <w:pPr>
+        <w:pStyle w:val="Compact"/>
         <w:numPr>
           <w:ilvl w:val="0"/>
           <w:numId w:val="1007"/>
         </w:numPr>
-        <w:pStyle w:val="Compact"/>
       </w:pPr>
       <m:oMath>
         <m:r>
@@ -3644,11 +3476,11 @@
     </w:p>
     <w:p>
       <w:pPr>
+        <w:pStyle w:val="Compact"/>
         <w:numPr>
           <w:ilvl w:val="0"/>
           <w:numId w:val="1007"/>
         </w:numPr>
-        <w:pStyle w:val="Compact"/>
       </w:pPr>
       <m:oMath>
         <m:r>
@@ -3695,11 +3527,11 @@
     </w:p>
     <w:p>
       <w:pPr>
+        <w:pStyle w:val="Compact"/>
         <w:numPr>
           <w:ilvl w:val="0"/>
           <w:numId w:val="1007"/>
         </w:numPr>
-        <w:pStyle w:val="Compact"/>
       </w:pPr>
       <m:oMath>
         <m:r>
@@ -3740,11 +3572,11 @@
     </w:p>
     <w:p>
       <w:pPr>
+        <w:pStyle w:val="Compact"/>
         <w:numPr>
           <w:ilvl w:val="0"/>
           <w:numId w:val="1007"/>
         </w:numPr>
-        <w:pStyle w:val="Compact"/>
       </w:pPr>
       <m:oMath>
         <m:r>
@@ -3775,11 +3607,11 @@
     </w:p>
     <w:p>
       <w:pPr>
+        <w:pStyle w:val="Compact"/>
         <w:numPr>
           <w:ilvl w:val="0"/>
           <w:numId w:val="1007"/>
         </w:numPr>
-        <w:pStyle w:val="Compact"/>
       </w:pPr>
       <m:oMath>
         <m:r>
@@ -3820,11 +3652,11 @@
     </w:p>
     <w:p>
       <w:pPr>
+        <w:pStyle w:val="Compact"/>
         <w:numPr>
           <w:ilvl w:val="0"/>
           <w:numId w:val="1007"/>
         </w:numPr>
-        <w:pStyle w:val="Compact"/>
       </w:pPr>
       <m:oMath>
         <m:r>
@@ -3865,11 +3697,11 @@
     </w:p>
     <w:p>
       <w:pPr>
+        <w:pStyle w:val="Compact"/>
         <w:numPr>
           <w:ilvl w:val="0"/>
           <w:numId w:val="1007"/>
         </w:numPr>
-        <w:pStyle w:val="Compact"/>
       </w:pPr>
       <m:oMath>
         <m:r>
@@ -3916,11 +3748,11 @@
     </w:p>
     <w:p>
       <w:pPr>
+        <w:pStyle w:val="Compact"/>
         <w:numPr>
           <w:ilvl w:val="0"/>
           <w:numId w:val="1007"/>
         </w:numPr>
-        <w:pStyle w:val="Compact"/>
       </w:pPr>
       <m:oMath>
         <m:r>
@@ -3961,11 +3793,11 @@
     </w:p>
     <w:p>
       <w:pPr>
+        <w:pStyle w:val="Compact"/>
         <w:numPr>
           <w:ilvl w:val="0"/>
           <w:numId w:val="1007"/>
         </w:numPr>
-        <w:pStyle w:val="Compact"/>
       </w:pPr>
       <m:oMath>
         <m:r>
@@ -3996,11 +3828,11 @@
     </w:p>
     <w:p>
       <w:pPr>
+        <w:pStyle w:val="Compact"/>
         <w:numPr>
           <w:ilvl w:val="0"/>
           <w:numId w:val="1007"/>
         </w:numPr>
-        <w:pStyle w:val="Compact"/>
       </w:pPr>
       <m:oMath>
         <m:r>
@@ -4041,11 +3873,11 @@
     </w:p>
     <w:p>
       <w:pPr>
+        <w:pStyle w:val="Compact"/>
         <w:numPr>
           <w:ilvl w:val="0"/>
           <w:numId w:val="1007"/>
         </w:numPr>
-        <w:pStyle w:val="Compact"/>
       </w:pPr>
       <m:oMath>
         <m:r>
@@ -4076,11 +3908,11 @@
     </w:p>
     <w:p>
       <w:pPr>
+        <w:pStyle w:val="Compact"/>
         <w:numPr>
           <w:ilvl w:val="0"/>
           <w:numId w:val="1007"/>
         </w:numPr>
-        <w:pStyle w:val="Compact"/>
       </w:pPr>
       <m:oMath>
         <m:r>
@@ -4121,11 +3953,11 @@
     </w:p>
     <w:p>
       <w:pPr>
+        <w:pStyle w:val="Compact"/>
         <w:numPr>
           <w:ilvl w:val="0"/>
           <w:numId w:val="1007"/>
         </w:numPr>
-        <w:pStyle w:val="Compact"/>
       </w:pPr>
       <m:oMath>
         <m:r>
@@ -4305,11 +4137,11 @@
     </w:p>
     <w:p>
       <w:pPr>
+        <w:pStyle w:val="Compact"/>
         <w:numPr>
           <w:ilvl w:val="0"/>
           <w:numId w:val="1008"/>
         </w:numPr>
-        <w:pStyle w:val="Compact"/>
       </w:pPr>
       <w:r>
         <w:t xml:space="preserve">kannst die Begriffe positive Zahlen, negative Zahlen, ganze Zahlen und</w:t>
@@ -4323,11 +4155,11 @@
     </w:p>
     <w:p>
       <w:pPr>
+        <w:pStyle w:val="Compact"/>
         <w:numPr>
           <w:ilvl w:val="0"/>
           <w:numId w:val="1008"/>
         </w:numPr>
-        <w:pStyle w:val="Compact"/>
       </w:pPr>
       <w:r>
         <w:t xml:space="preserve">kannst ganze Zahlen auf einem Zahlengerade eintragen.</w:t>
@@ -4335,11 +4167,11 @@
     </w:p>
     <w:p>
       <w:pPr>
+        <w:pStyle w:val="Compact"/>
         <w:numPr>
           <w:ilvl w:val="0"/>
           <w:numId w:val="1008"/>
         </w:numPr>
-        <w:pStyle w:val="Compact"/>
       </w:pPr>
       <w:r>
         <w:t xml:space="preserve">kannst ganze Zahlen der Grösse nach ordnen und miteinander vergleichen.</w:t>
@@ -4347,11 +4179,11 @@
     </w:p>
     <w:p>
       <w:pPr>
+        <w:pStyle w:val="Compact"/>
         <w:numPr>
           <w:ilvl w:val="0"/>
           <w:numId w:val="1008"/>
         </w:numPr>
-        <w:pStyle w:val="Compact"/>
       </w:pPr>
       <w:r>
         <w:t xml:space="preserve">kannst die negativen Zahlen in einem realen Kontext anwenden, z.B. bei</w:t>
@@ -4365,11 +4197,11 @@
     </w:p>
     <w:p>
       <w:pPr>
+        <w:pStyle w:val="Compact"/>
         <w:numPr>
           <w:ilvl w:val="0"/>
           <w:numId w:val="1008"/>
         </w:numPr>
-        <w:pStyle w:val="Compact"/>
       </w:pPr>
       <w:r>
         <w:t xml:space="preserve">kannst die Grundoperationen (Addition, Subtraktion, Multiplikation und</w:t>
@@ -4398,8 +4230,8 @@
       </w:pPr>
       <w:r>
         <w:rPr>
+          <w:b/>
           <w:bCs/>
-          <w:b/>
         </w:rPr>
         <w:t xml:space="preserve">Übungsaufgabe 4</w:t>
       </w:r>
@@ -4430,11 +4262,11 @@
     </w:p>
     <w:p>
       <w:pPr>
+        <w:pStyle w:val="Compact"/>
         <w:numPr>
           <w:ilvl w:val="0"/>
           <w:numId w:val="1009"/>
         </w:numPr>
-        <w:pStyle w:val="Compact"/>
       </w:pPr>
       <w:r>
         <w:t xml:space="preserve">Zunächst sinkt die Temperatur um 9 °C.</w:t>
@@ -4442,11 +4274,11 @@
     </w:p>
     <w:p>
       <w:pPr>
+        <w:pStyle w:val="Compact"/>
         <w:numPr>
           <w:ilvl w:val="0"/>
           <w:numId w:val="1009"/>
         </w:numPr>
-        <w:pStyle w:val="Compact"/>
       </w:pPr>
       <w:r>
         <w:t xml:space="preserve">Anschliessend steigt sie wieder um 4 °C.</w:t>
@@ -4454,11 +4286,11 @@
     </w:p>
     <w:p>
       <w:pPr>
+        <w:pStyle w:val="Compact"/>
         <w:numPr>
           <w:ilvl w:val="0"/>
           <w:numId w:val="1009"/>
         </w:numPr>
-        <w:pStyle w:val="Compact"/>
       </w:pPr>
       <w:r>
         <w:t xml:space="preserve">Danach sinkt sie erneut um 12 °C.</w:t>
@@ -4685,8 +4517,8 @@
       </w:pPr>
       <w:r>
         <w:rPr>
+          <w:b/>
           <w:bCs/>
-          <w:b/>
         </w:rPr>
         <w:t xml:space="preserve">Übungsaufgabe 5</w:t>
       </w:r>
@@ -4865,8 +4697,8 @@
       </w:r>
       <w:r>
         <w:rPr>
+          <w:b/>
           <w:bCs/>
-          <w:b/>
         </w:rPr>
         <w:t xml:space="preserve">Rot</w:t>
       </w:r>
@@ -4881,8 +4713,8 @@
       </w:r>
       <w:r>
         <w:rPr>
+          <w:b/>
           <w:bCs/>
-          <w:b/>
         </w:rPr>
         <w:t xml:space="preserve">positiven Zahlen</w:t>
       </w:r>
@@ -4897,8 +4729,8 @@
       </w:r>
       <w:r>
         <w:rPr>
+          <w:b/>
           <w:bCs/>
-          <w:b/>
         </w:rPr>
         <w:t xml:space="preserve">blau</w:t>
       </w:r>
@@ -4913,8 +4745,8 @@
       </w:r>
       <w:r>
         <w:rPr>
+          <w:b/>
           <w:bCs/>
-          <w:b/>
         </w:rPr>
         <w:t xml:space="preserve">negativen Zahlen</w:t>
       </w:r>
@@ -5135,8 +4967,8 @@
       </w:pPr>
       <w:r>
         <w:rPr>
+          <w:b/>
           <w:bCs/>
-          <w:b/>
         </w:rPr>
         <w:t xml:space="preserve">Übungsaufgabe 6</w:t>
       </w:r>
@@ -5155,11 +4987,11 @@
     </w:p>
     <w:p>
       <w:pPr>
+        <w:pStyle w:val="Compact"/>
         <w:numPr>
           <w:ilvl w:val="0"/>
           <w:numId w:val="1010"/>
         </w:numPr>
-        <w:pStyle w:val="Compact"/>
       </w:pPr>
       <w:r>
         <w:t xml:space="preserve">-1, 5, -17, -9, -25</w:t>
@@ -5167,11 +4999,11 @@
     </w:p>
     <w:p>
       <w:pPr>
+        <w:pStyle w:val="Compact"/>
         <w:numPr>
           <w:ilvl w:val="0"/>
           <w:numId w:val="1010"/>
         </w:numPr>
-        <w:pStyle w:val="Compact"/>
       </w:pPr>
       <w:r>
         <w:t xml:space="preserve">-7.5, -28.75, -20.3, -32.6</w:t>
@@ -5596,8 +5428,8 @@
       </w:pPr>
       <w:r>
         <w:rPr>
+          <w:b/>
           <w:bCs/>
-          <w:b/>
         </w:rPr>
         <w:t xml:space="preserve">Übungsaufgabe 7 (Berechne!)</w:t>
       </w:r>
@@ -5610,11 +5442,11 @@
     </w:p>
     <w:p>
       <w:pPr>
+        <w:pStyle w:val="Compact"/>
         <w:numPr>
           <w:ilvl w:val="0"/>
           <w:numId w:val="1011"/>
         </w:numPr>
-        <w:pStyle w:val="Compact"/>
       </w:pPr>
       <w:r>
         <w:t xml:space="preserve">−7 + 9 =</w:t>
@@ -5622,11 +5454,11 @@
     </w:p>
     <w:p>
       <w:pPr>
+        <w:pStyle w:val="Compact"/>
         <w:numPr>
           <w:ilvl w:val="0"/>
           <w:numId w:val="1011"/>
         </w:numPr>
-        <w:pStyle w:val="Compact"/>
       </w:pPr>
       <w:r>
         <w:t xml:space="preserve">−5 + −7 =</w:t>
@@ -5634,11 +5466,11 @@
     </w:p>
     <w:p>
       <w:pPr>
+        <w:pStyle w:val="Compact"/>
         <w:numPr>
           <w:ilvl w:val="0"/>
           <w:numId w:val="1011"/>
         </w:numPr>
-        <w:pStyle w:val="Compact"/>
       </w:pPr>
       <w:r>
         <w:t xml:space="preserve">−3 + 4 =</w:t>
@@ -5646,11 +5478,11 @@
     </w:p>
     <w:p>
       <w:pPr>
+        <w:pStyle w:val="Compact"/>
         <w:numPr>
           <w:ilvl w:val="0"/>
           <w:numId w:val="1011"/>
         </w:numPr>
-        <w:pStyle w:val="Compact"/>
       </w:pPr>
       <w:r>
         <w:t xml:space="preserve">−9 + −10 =</w:t>
@@ -5658,11 +5490,11 @@
     </w:p>
     <w:p>
       <w:pPr>
+        <w:pStyle w:val="Compact"/>
         <w:numPr>
           <w:ilvl w:val="0"/>
           <w:numId w:val="1011"/>
         </w:numPr>
-        <w:pStyle w:val="Compact"/>
       </w:pPr>
       <w:r>
         <w:t xml:space="preserve">−6 + 1 =</w:t>
@@ -5670,11 +5502,11 @@
     </w:p>
     <w:p>
       <w:pPr>
+        <w:pStyle w:val="Compact"/>
         <w:numPr>
           <w:ilvl w:val="0"/>
           <w:numId w:val="1011"/>
         </w:numPr>
-        <w:pStyle w:val="Compact"/>
       </w:pPr>
       <w:r>
         <w:t xml:space="preserve">−4 + 5 =</w:t>
@@ -5682,11 +5514,11 @@
     </w:p>
     <w:p>
       <w:pPr>
+        <w:pStyle w:val="Compact"/>
         <w:numPr>
           <w:ilvl w:val="0"/>
           <w:numId w:val="1011"/>
         </w:numPr>
-        <w:pStyle w:val="Compact"/>
       </w:pPr>
       <w:r>
         <w:t xml:space="preserve">−4 + −6 =</w:t>
@@ -5694,11 +5526,11 @@
     </w:p>
     <w:p>
       <w:pPr>
+        <w:pStyle w:val="Compact"/>
         <w:numPr>
           <w:ilvl w:val="0"/>
           <w:numId w:val="1011"/>
         </w:numPr>
-        <w:pStyle w:val="Compact"/>
       </w:pPr>
       <w:r>
         <w:t xml:space="preserve">−9 + 5 =</w:t>
@@ -5706,11 +5538,11 @@
     </w:p>
     <w:p>
       <w:pPr>
+        <w:pStyle w:val="Compact"/>
         <w:numPr>
           <w:ilvl w:val="0"/>
           <w:numId w:val="1011"/>
         </w:numPr>
-        <w:pStyle w:val="Compact"/>
       </w:pPr>
       <w:r>
         <w:t xml:space="preserve">−6 + −10 =</w:t>
@@ -5718,11 +5550,11 @@
     </w:p>
     <w:p>
       <w:pPr>
+        <w:pStyle w:val="Compact"/>
         <w:numPr>
           <w:ilvl w:val="0"/>
           <w:numId w:val="1011"/>
         </w:numPr>
-        <w:pStyle w:val="Compact"/>
       </w:pPr>
       <w:r>
         <w:t xml:space="preserve">−2 + −11 =</w:t>
@@ -5730,11 +5562,11 @@
     </w:p>
     <w:p>
       <w:pPr>
+        <w:pStyle w:val="Compact"/>
         <w:numPr>
           <w:ilvl w:val="0"/>
           <w:numId w:val="1011"/>
         </w:numPr>
-        <w:pStyle w:val="Compact"/>
       </w:pPr>
       <w:r>
         <w:t xml:space="preserve">−6 + −15 =</w:t>
@@ -5742,11 +5574,11 @@
     </w:p>
     <w:p>
       <w:pPr>
+        <w:pStyle w:val="Compact"/>
         <w:numPr>
           <w:ilvl w:val="0"/>
           <w:numId w:val="1011"/>
         </w:numPr>
-        <w:pStyle w:val="Compact"/>
       </w:pPr>
       <w:r>
         <w:t xml:space="preserve">−7 + −13 =</w:t>
@@ -5754,11 +5586,11 @@
     </w:p>
     <w:p>
       <w:pPr>
+        <w:pStyle w:val="Compact"/>
         <w:numPr>
           <w:ilvl w:val="0"/>
           <w:numId w:val="1011"/>
         </w:numPr>
-        <w:pStyle w:val="Compact"/>
       </w:pPr>
       <w:r>
         <w:t xml:space="preserve">−4 + −13 =</w:t>
@@ -5766,11 +5598,11 @@
     </w:p>
     <w:p>
       <w:pPr>
+        <w:pStyle w:val="Compact"/>
         <w:numPr>
           <w:ilvl w:val="0"/>
           <w:numId w:val="1011"/>
         </w:numPr>
-        <w:pStyle w:val="Compact"/>
       </w:pPr>
       <w:r>
         <w:t xml:space="preserve">−5 + 8 =</w:t>
@@ -5778,11 +5610,11 @@
     </w:p>
     <w:p>
       <w:pPr>
+        <w:pStyle w:val="Compact"/>
         <w:numPr>
           <w:ilvl w:val="0"/>
           <w:numId w:val="1011"/>
         </w:numPr>
-        <w:pStyle w:val="Compact"/>
       </w:pPr>
       <w:r>
         <w:t xml:space="preserve">−2 + 8 =</w:t>
@@ -5790,11 +5622,11 @@
     </w:p>
     <w:p>
       <w:pPr>
+        <w:pStyle w:val="Compact"/>
         <w:numPr>
           <w:ilvl w:val="0"/>
           <w:numId w:val="1011"/>
         </w:numPr>
-        <w:pStyle w:val="Compact"/>
       </w:pPr>
       <w:r>
         <w:t xml:space="preserve">−5 + −3 =</w:t>
@@ -5802,11 +5634,11 @@
     </w:p>
     <w:p>
       <w:pPr>
+        <w:pStyle w:val="Compact"/>
         <w:numPr>
           <w:ilvl w:val="0"/>
           <w:numId w:val="1011"/>
         </w:numPr>
-        <w:pStyle w:val="Compact"/>
       </w:pPr>
       <w:r>
         <w:t xml:space="preserve">−4 + −10 =</w:t>
@@ -5814,11 +5646,11 @@
     </w:p>
     <w:p>
       <w:pPr>
+        <w:pStyle w:val="Compact"/>
         <w:numPr>
           <w:ilvl w:val="0"/>
           <w:numId w:val="1011"/>
         </w:numPr>
-        <w:pStyle w:val="Compact"/>
       </w:pPr>
       <w:r>
         <w:t xml:space="preserve">−7 + 4 =</w:t>
@@ -5826,11 +5658,11 @@
     </w:p>
     <w:p>
       <w:pPr>
+        <w:pStyle w:val="Compact"/>
         <w:numPr>
           <w:ilvl w:val="0"/>
           <w:numId w:val="1011"/>
         </w:numPr>
-        <w:pStyle w:val="Compact"/>
       </w:pPr>
       <w:r>
         <w:t xml:space="preserve">−5 + −9 =</w:t>
@@ -5838,11 +5670,11 @@
     </w:p>
     <w:p>
       <w:pPr>
+        <w:pStyle w:val="Compact"/>
         <w:numPr>
           <w:ilvl w:val="0"/>
           <w:numId w:val="1011"/>
         </w:numPr>
-        <w:pStyle w:val="Compact"/>
       </w:pPr>
       <w:r>
         <w:t xml:space="preserve">−2 + 5 =</w:t>
@@ -5850,11 +5682,11 @@
     </w:p>
     <w:p>
       <w:pPr>
+        <w:pStyle w:val="Compact"/>
         <w:numPr>
           <w:ilvl w:val="0"/>
           <w:numId w:val="1011"/>
         </w:numPr>
-        <w:pStyle w:val="Compact"/>
       </w:pPr>
       <w:r>
         <w:t xml:space="preserve">−6 + 6 =</w:t>
@@ -5862,11 +5694,11 @@
     </w:p>
     <w:p>
       <w:pPr>
+        <w:pStyle w:val="Compact"/>
         <w:numPr>
           <w:ilvl w:val="0"/>
           <w:numId w:val="1011"/>
         </w:numPr>
-        <w:pStyle w:val="Compact"/>
       </w:pPr>
       <w:r>
         <w:t xml:space="preserve">−4 + 7 =</w:t>
@@ -5874,11 +5706,11 @@
     </w:p>
     <w:p>
       <w:pPr>
+        <w:pStyle w:val="Compact"/>
         <w:numPr>
           <w:ilvl w:val="0"/>
           <w:numId w:val="1011"/>
         </w:numPr>
-        <w:pStyle w:val="Compact"/>
       </w:pPr>
       <w:r>
         <w:t xml:space="preserve">−2 + −6 =</w:t>
@@ -5886,11 +5718,11 @@
     </w:p>
     <w:p>
       <w:pPr>
+        <w:pStyle w:val="Compact"/>
         <w:numPr>
           <w:ilvl w:val="0"/>
           <w:numId w:val="1011"/>
         </w:numPr>
-        <w:pStyle w:val="Compact"/>
       </w:pPr>
       <w:r>
         <w:t xml:space="preserve">−5 + −4 =</w:t>
@@ -6187,8 +6019,8 @@
       </w:pPr>
       <w:r>
         <w:rPr>
+          <w:b/>
           <w:bCs/>
-          <w:b/>
         </w:rPr>
         <w:t xml:space="preserve">Übungsaufgabe 8 (Berechne!)</w:t>
       </w:r>
@@ -6201,11 +6033,11 @@
     </w:p>
     <w:p>
       <w:pPr>
+        <w:pStyle w:val="Compact"/>
         <w:numPr>
           <w:ilvl w:val="0"/>
           <w:numId w:val="1012"/>
         </w:numPr>
-        <w:pStyle w:val="Compact"/>
       </w:pPr>
       <m:oMath>
         <m:r>
@@ -6252,11 +6084,11 @@
     </w:p>
     <w:p>
       <w:pPr>
+        <w:pStyle w:val="Compact"/>
         <w:numPr>
           <w:ilvl w:val="0"/>
           <w:numId w:val="1012"/>
         </w:numPr>
-        <w:pStyle w:val="Compact"/>
       </w:pPr>
       <m:oMath>
         <m:r>
@@ -6303,11 +6135,11 @@
     </w:p>
     <w:p>
       <w:pPr>
+        <w:pStyle w:val="Compact"/>
         <w:numPr>
           <w:ilvl w:val="0"/>
           <w:numId w:val="1012"/>
         </w:numPr>
-        <w:pStyle w:val="Compact"/>
       </w:pPr>
       <m:oMath>
         <m:r>
@@ -6354,11 +6186,11 @@
     </w:p>
     <w:p>
       <w:pPr>
+        <w:pStyle w:val="Compact"/>
         <w:numPr>
           <w:ilvl w:val="0"/>
           <w:numId w:val="1012"/>
         </w:numPr>
-        <w:pStyle w:val="Compact"/>
       </w:pPr>
       <m:oMath>
         <m:r>
@@ -6399,11 +6231,11 @@
     </w:p>
     <w:p>
       <w:pPr>
+        <w:pStyle w:val="Compact"/>
         <w:numPr>
           <w:ilvl w:val="0"/>
           <w:numId w:val="1012"/>
         </w:numPr>
-        <w:pStyle w:val="Compact"/>
       </w:pPr>
       <m:oMath>
         <m:r>
@@ -6450,11 +6282,11 @@
     </w:p>
     <w:p>
       <w:pPr>
+        <w:pStyle w:val="Compact"/>
         <w:numPr>
           <w:ilvl w:val="0"/>
           <w:numId w:val="1012"/>
         </w:numPr>
-        <w:pStyle w:val="Compact"/>
       </w:pPr>
       <m:oMath>
         <m:r>
@@ -6501,11 +6333,11 @@
     </w:p>
     <w:p>
       <w:pPr>
+        <w:pStyle w:val="Compact"/>
         <w:numPr>
           <w:ilvl w:val="0"/>
           <w:numId w:val="1012"/>
         </w:numPr>
-        <w:pStyle w:val="Compact"/>
       </w:pPr>
       <m:oMath>
         <m:r>
@@ -6552,11 +6384,11 @@
     </w:p>
     <w:p>
       <w:pPr>
+        <w:pStyle w:val="Compact"/>
         <w:numPr>
           <w:ilvl w:val="0"/>
           <w:numId w:val="1012"/>
         </w:numPr>
-        <w:pStyle w:val="Compact"/>
       </w:pPr>
       <m:oMath>
         <m:r>
@@ -6603,11 +6435,11 @@
     </w:p>
     <w:p>
       <w:pPr>
+        <w:pStyle w:val="Compact"/>
         <w:numPr>
           <w:ilvl w:val="0"/>
           <w:numId w:val="1012"/>
         </w:numPr>
-        <w:pStyle w:val="Compact"/>
       </w:pPr>
       <m:oMath>
         <m:r>
@@ -6654,11 +6486,11 @@
     </w:p>
     <w:p>
       <w:pPr>
+        <w:pStyle w:val="Compact"/>
         <w:numPr>
           <w:ilvl w:val="0"/>
           <w:numId w:val="1012"/>
         </w:numPr>
-        <w:pStyle w:val="Compact"/>
       </w:pPr>
       <m:oMath>
         <m:r>
@@ -6705,11 +6537,11 @@
     </w:p>
     <w:p>
       <w:pPr>
+        <w:pStyle w:val="Compact"/>
         <w:numPr>
           <w:ilvl w:val="0"/>
           <w:numId w:val="1012"/>
         </w:numPr>
-        <w:pStyle w:val="Compact"/>
       </w:pPr>
       <m:oMath>
         <m:r>
@@ -6756,11 +6588,11 @@
     </w:p>
     <w:p>
       <w:pPr>
+        <w:pStyle w:val="Compact"/>
         <w:numPr>
           <w:ilvl w:val="0"/>
           <w:numId w:val="1012"/>
         </w:numPr>
-        <w:pStyle w:val="Compact"/>
       </w:pPr>
       <m:oMath>
         <m:r>
@@ -6807,11 +6639,11 @@
     </w:p>
     <w:p>
       <w:pPr>
+        <w:pStyle w:val="Compact"/>
         <w:numPr>
           <w:ilvl w:val="0"/>
           <w:numId w:val="1012"/>
         </w:numPr>
-        <w:pStyle w:val="Compact"/>
       </w:pPr>
       <m:oMath>
         <m:r>
@@ -6858,11 +6690,11 @@
     </w:p>
     <w:p>
       <w:pPr>
+        <w:pStyle w:val="Compact"/>
         <w:numPr>
           <w:ilvl w:val="0"/>
           <w:numId w:val="1012"/>
         </w:numPr>
-        <w:pStyle w:val="Compact"/>
       </w:pPr>
       <m:oMath>
         <m:r>
@@ -6909,11 +6741,11 @@
     </w:p>
     <w:p>
       <w:pPr>
+        <w:pStyle w:val="Compact"/>
         <w:numPr>
           <w:ilvl w:val="0"/>
           <w:numId w:val="1012"/>
         </w:numPr>
-        <w:pStyle w:val="Compact"/>
       </w:pPr>
       <m:oMath>
         <m:r>
@@ -6960,11 +6792,11 @@
     </w:p>
     <w:p>
       <w:pPr>
+        <w:pStyle w:val="Compact"/>
         <w:numPr>
           <w:ilvl w:val="0"/>
           <w:numId w:val="1012"/>
         </w:numPr>
-        <w:pStyle w:val="Compact"/>
       </w:pPr>
       <m:oMath>
         <m:r>
@@ -7005,11 +6837,11 @@
     </w:p>
     <w:p>
       <w:pPr>
+        <w:pStyle w:val="Compact"/>
         <w:numPr>
           <w:ilvl w:val="0"/>
           <w:numId w:val="1012"/>
         </w:numPr>
-        <w:pStyle w:val="Compact"/>
       </w:pPr>
       <m:oMath>
         <m:r>
@@ -7056,11 +6888,11 @@
     </w:p>
     <w:p>
       <w:pPr>
+        <w:pStyle w:val="Compact"/>
         <w:numPr>
           <w:ilvl w:val="0"/>
           <w:numId w:val="1012"/>
         </w:numPr>
-        <w:pStyle w:val="Compact"/>
       </w:pPr>
       <m:oMath>
         <m:r>
@@ -7107,11 +6939,11 @@
     </w:p>
     <w:p>
       <w:pPr>
+        <w:pStyle w:val="Compact"/>
         <w:numPr>
           <w:ilvl w:val="0"/>
           <w:numId w:val="1012"/>
         </w:numPr>
-        <w:pStyle w:val="Compact"/>
       </w:pPr>
       <m:oMath>
         <m:r>
@@ -7158,11 +6990,11 @@
     </w:p>
     <w:p>
       <w:pPr>
+        <w:pStyle w:val="Compact"/>
         <w:numPr>
           <w:ilvl w:val="0"/>
           <w:numId w:val="1012"/>
         </w:numPr>
-        <w:pStyle w:val="Compact"/>
       </w:pPr>
       <m:oMath>
         <m:r>
@@ -7209,11 +7041,11 @@
     </w:p>
     <w:p>
       <w:pPr>
+        <w:pStyle w:val="Compact"/>
         <w:numPr>
           <w:ilvl w:val="0"/>
           <w:numId w:val="1012"/>
         </w:numPr>
-        <w:pStyle w:val="Compact"/>
       </w:pPr>
       <m:oMath>
         <m:r>
@@ -7254,11 +7086,11 @@
     </w:p>
     <w:p>
       <w:pPr>
+        <w:pStyle w:val="Compact"/>
         <w:numPr>
           <w:ilvl w:val="0"/>
           <w:numId w:val="1012"/>
         </w:numPr>
-        <w:pStyle w:val="Compact"/>
       </w:pPr>
       <m:oMath>
         <m:r>
@@ -7305,11 +7137,11 @@
     </w:p>
     <w:p>
       <w:pPr>
+        <w:pStyle w:val="Compact"/>
         <w:numPr>
           <w:ilvl w:val="0"/>
           <w:numId w:val="1012"/>
         </w:numPr>
-        <w:pStyle w:val="Compact"/>
       </w:pPr>
       <m:oMath>
         <m:r>
@@ -7356,11 +7188,11 @@
     </w:p>
     <w:p>
       <w:pPr>
+        <w:pStyle w:val="Compact"/>
         <w:numPr>
           <w:ilvl w:val="0"/>
           <w:numId w:val="1012"/>
         </w:numPr>
-        <w:pStyle w:val="Compact"/>
       </w:pPr>
       <m:oMath>
         <m:r>
@@ -7407,8 +7239,8 @@
       </w:pPr>
       <w:r>
         <w:rPr>
+          <w:b/>
           <w:bCs/>
-          <w:b/>
         </w:rPr>
         <w:t xml:space="preserve">Übungsaufgabe 9 (Vermischte Aufgaben)</w:t>
       </w:r>
@@ -7421,11 +7253,11 @@
     </w:p>
     <w:p>
       <w:pPr>
+        <w:pStyle w:val="Compact"/>
         <w:numPr>
           <w:ilvl w:val="0"/>
           <w:numId w:val="1013"/>
         </w:numPr>
-        <w:pStyle w:val="Compact"/>
       </w:pPr>
       <m:oMath>
         <m:r>
@@ -7472,11 +7304,11 @@
     </w:p>
     <w:p>
       <w:pPr>
+        <w:pStyle w:val="Compact"/>
         <w:numPr>
           <w:ilvl w:val="0"/>
           <w:numId w:val="1013"/>
         </w:numPr>
-        <w:pStyle w:val="Compact"/>
       </w:pPr>
       <m:oMath>
         <m:r>
@@ -7519,11 +7351,11 @@
     </w:p>
     <w:p>
       <w:pPr>
+        <w:pStyle w:val="Compact"/>
         <w:numPr>
           <w:ilvl w:val="0"/>
           <w:numId w:val="1013"/>
         </w:numPr>
-        <w:pStyle w:val="Compact"/>
       </w:pPr>
       <m:oMath>
         <m:r>
@@ -7554,11 +7386,11 @@
     </w:p>
     <w:p>
       <w:pPr>
+        <w:pStyle w:val="Compact"/>
         <w:numPr>
           <w:ilvl w:val="0"/>
           <w:numId w:val="1013"/>
         </w:numPr>
-        <w:pStyle w:val="Compact"/>
       </w:pPr>
       <m:oMath>
         <m:r>
@@ -7605,11 +7437,11 @@
     </w:p>
     <w:p>
       <w:pPr>
+        <w:pStyle w:val="Compact"/>
         <w:numPr>
           <w:ilvl w:val="0"/>
           <w:numId w:val="1013"/>
         </w:numPr>
-        <w:pStyle w:val="Compact"/>
       </w:pPr>
       <m:oMath>
         <m:r>
@@ -7656,11 +7488,11 @@
     </w:p>
     <w:p>
       <w:pPr>
+        <w:pStyle w:val="Compact"/>
         <w:numPr>
           <w:ilvl w:val="0"/>
           <w:numId w:val="1013"/>
         </w:numPr>
-        <w:pStyle w:val="Compact"/>
       </w:pPr>
       <m:oMath>
         <m:r>
@@ -7703,11 +7535,11 @@
     </w:p>
     <w:p>
       <w:pPr>
+        <w:pStyle w:val="Compact"/>
         <w:numPr>
           <w:ilvl w:val="0"/>
           <w:numId w:val="1013"/>
         </w:numPr>
-        <w:pStyle w:val="Compact"/>
       </w:pPr>
       <m:oMath>
         <m:r>
@@ -7750,11 +7582,11 @@
     </w:p>
     <w:p>
       <w:pPr>
+        <w:pStyle w:val="Compact"/>
         <w:numPr>
           <w:ilvl w:val="0"/>
           <w:numId w:val="1013"/>
         </w:numPr>
-        <w:pStyle w:val="Compact"/>
       </w:pPr>
       <m:oMath>
         <m:r>
@@ -7797,11 +7629,11 @@
     </w:p>
     <w:p>
       <w:pPr>
+        <w:pStyle w:val="Compact"/>
         <w:numPr>
           <w:ilvl w:val="0"/>
           <w:numId w:val="1013"/>
         </w:numPr>
-        <w:pStyle w:val="Compact"/>
       </w:pPr>
       <m:oMath>
         <m:r>
@@ -7832,11 +7664,11 @@
     </w:p>
     <w:p>
       <w:pPr>
+        <w:pStyle w:val="Compact"/>
         <w:numPr>
           <w:ilvl w:val="0"/>
           <w:numId w:val="1013"/>
         </w:numPr>
-        <w:pStyle w:val="Compact"/>
       </w:pPr>
       <m:oMath>
         <m:r>
@@ -7879,11 +7711,11 @@
     </w:p>
     <w:p>
       <w:pPr>
+        <w:pStyle w:val="Compact"/>
         <w:numPr>
           <w:ilvl w:val="0"/>
           <w:numId w:val="1013"/>
         </w:numPr>
-        <w:pStyle w:val="Compact"/>
       </w:pPr>
       <m:oMath>
         <m:r>
@@ -7926,11 +7758,11 @@
     </w:p>
     <w:p>
       <w:pPr>
+        <w:pStyle w:val="Compact"/>
         <w:numPr>
           <w:ilvl w:val="0"/>
           <w:numId w:val="1013"/>
         </w:numPr>
-        <w:pStyle w:val="Compact"/>
       </w:pPr>
       <m:oMath>
         <m:r>
@@ -7973,11 +7805,11 @@
     </w:p>
     <w:p>
       <w:pPr>
+        <w:pStyle w:val="Compact"/>
         <w:numPr>
           <w:ilvl w:val="0"/>
           <w:numId w:val="1013"/>
         </w:numPr>
-        <w:pStyle w:val="Compact"/>
       </w:pPr>
       <m:oMath>
         <m:r>
@@ -8024,11 +7856,11 @@
     </w:p>
     <w:p>
       <w:pPr>
+        <w:pStyle w:val="Compact"/>
         <w:numPr>
           <w:ilvl w:val="0"/>
           <w:numId w:val="1013"/>
         </w:numPr>
-        <w:pStyle w:val="Compact"/>
       </w:pPr>
       <m:oMath>
         <m:r>
@@ -8075,11 +7907,11 @@
     </w:p>
     <w:p>
       <w:pPr>
+        <w:pStyle w:val="Compact"/>
         <w:numPr>
           <w:ilvl w:val="0"/>
           <w:numId w:val="1013"/>
         </w:numPr>
-        <w:pStyle w:val="Compact"/>
       </w:pPr>
       <m:oMath>
         <m:r>
@@ -8120,11 +7952,11 @@
     </w:p>
     <w:p>
       <w:pPr>
+        <w:pStyle w:val="Compact"/>
         <w:numPr>
           <w:ilvl w:val="0"/>
           <w:numId w:val="1013"/>
         </w:numPr>
-        <w:pStyle w:val="Compact"/>
       </w:pPr>
       <m:oMath>
         <m:r>
@@ -8155,11 +7987,11 @@
     </w:p>
     <w:p>
       <w:pPr>
+        <w:pStyle w:val="Compact"/>
         <w:numPr>
           <w:ilvl w:val="0"/>
           <w:numId w:val="1013"/>
         </w:numPr>
-        <w:pStyle w:val="Compact"/>
       </w:pPr>
       <m:oMath>
         <m:r>
@@ -8206,11 +8038,11 @@
     </w:p>
     <w:p>
       <w:pPr>
+        <w:pStyle w:val="Compact"/>
         <w:numPr>
           <w:ilvl w:val="0"/>
           <w:numId w:val="1013"/>
         </w:numPr>
-        <w:pStyle w:val="Compact"/>
       </w:pPr>
       <m:oMath>
         <m:r>
@@ -8247,11 +8079,11 @@
     </w:p>
     <w:p>
       <w:pPr>
+        <w:pStyle w:val="Compact"/>
         <w:numPr>
           <w:ilvl w:val="0"/>
           <w:numId w:val="1013"/>
         </w:numPr>
-        <w:pStyle w:val="Compact"/>
       </w:pPr>
       <m:oMath>
         <m:r>
@@ -8294,11 +8126,11 @@
     </w:p>
     <w:p>
       <w:pPr>
+        <w:pStyle w:val="Compact"/>
         <w:numPr>
           <w:ilvl w:val="0"/>
           <w:numId w:val="1013"/>
         </w:numPr>
-        <w:pStyle w:val="Compact"/>
       </w:pPr>
       <m:oMath>
         <m:r>
@@ -8329,11 +8161,11 @@
     </w:p>
     <w:p>
       <w:pPr>
+        <w:pStyle w:val="Compact"/>
         <w:numPr>
           <w:ilvl w:val="0"/>
           <w:numId w:val="1013"/>
         </w:numPr>
-        <w:pStyle w:val="Compact"/>
       </w:pPr>
       <m:oMath>
         <m:r>
@@ -8376,11 +8208,11 @@
     </w:p>
     <w:p>
       <w:pPr>
+        <w:pStyle w:val="Compact"/>
         <w:numPr>
           <w:ilvl w:val="0"/>
           <w:numId w:val="1013"/>
         </w:numPr>
-        <w:pStyle w:val="Compact"/>
       </w:pPr>
       <m:oMath>
         <m:r>
@@ -8421,11 +8253,11 @@
     </w:p>
     <w:p>
       <w:pPr>
+        <w:pStyle w:val="Compact"/>
         <w:numPr>
           <w:ilvl w:val="0"/>
           <w:numId w:val="1013"/>
         </w:numPr>
-        <w:pStyle w:val="Compact"/>
       </w:pPr>
       <m:oMath>
         <m:r>
@@ -8468,11 +8300,11 @@
     </w:p>
     <w:p>
       <w:pPr>
+        <w:pStyle w:val="Compact"/>
         <w:numPr>
           <w:ilvl w:val="0"/>
           <w:numId w:val="1013"/>
         </w:numPr>
-        <w:pStyle w:val="Compact"/>
       </w:pPr>
       <m:oMath>
         <m:r>
@@ -8515,11 +8347,11 @@
     </w:p>
     <w:p>
       <w:pPr>
+        <w:pStyle w:val="Compact"/>
         <w:numPr>
           <w:ilvl w:val="0"/>
           <w:numId w:val="1013"/>
         </w:numPr>
-        <w:pStyle w:val="Compact"/>
       </w:pPr>
       <m:oMath>
         <m:r>
@@ -8560,11 +8392,11 @@
     </w:p>
     <w:p>
       <w:pPr>
+        <w:pStyle w:val="Compact"/>
         <w:numPr>
           <w:ilvl w:val="0"/>
           <w:numId w:val="1013"/>
         </w:numPr>
-        <w:pStyle w:val="Compact"/>
       </w:pPr>
       <m:oMath>
         <m:r>
@@ -8607,11 +8439,11 @@
     </w:p>
     <w:p>
       <w:pPr>
+        <w:pStyle w:val="Compact"/>
         <w:numPr>
           <w:ilvl w:val="0"/>
           <w:numId w:val="1013"/>
         </w:numPr>
-        <w:pStyle w:val="Compact"/>
       </w:pPr>
       <m:oMath>
         <m:r>
@@ -8981,8 +8813,8 @@
       </w:pPr>
       <w:r>
         <w:rPr>
+          <w:b/>
           <w:bCs/>
-          <w:b/>
         </w:rPr>
         <w:t xml:space="preserve">Übungsaufgabe 10 (Berechne!)</w:t>
       </w:r>
@@ -8995,11 +8827,11 @@
     </w:p>
     <w:p>
       <w:pPr>
+        <w:pStyle w:val="Compact"/>
         <w:numPr>
           <w:ilvl w:val="0"/>
           <w:numId w:val="1014"/>
         </w:numPr>
-        <w:pStyle w:val="Compact"/>
       </w:pPr>
       <m:oMath>
         <m:r>
@@ -9024,11 +8856,11 @@
     </w:p>
     <w:p>
       <w:pPr>
+        <w:pStyle w:val="Compact"/>
         <w:numPr>
           <w:ilvl w:val="0"/>
           <w:numId w:val="1014"/>
         </w:numPr>
-        <w:pStyle w:val="Compact"/>
       </w:pPr>
       <m:oMath>
         <m:r>
@@ -9053,11 +8885,11 @@
     </w:p>
     <w:p>
       <w:pPr>
+        <w:pStyle w:val="Compact"/>
         <w:numPr>
           <w:ilvl w:val="0"/>
           <w:numId w:val="1014"/>
         </w:numPr>
-        <w:pStyle w:val="Compact"/>
       </w:pPr>
       <m:oMath>
         <m:r>
@@ -9088,11 +8920,11 @@
     </w:p>
     <w:p>
       <w:pPr>
+        <w:pStyle w:val="Compact"/>
         <w:numPr>
           <w:ilvl w:val="0"/>
           <w:numId w:val="1014"/>
         </w:numPr>
-        <w:pStyle w:val="Compact"/>
       </w:pPr>
       <m:oMath>
         <m:r>
@@ -9117,11 +8949,11 @@
     </w:p>
     <w:p>
       <w:pPr>
+        <w:pStyle w:val="Compact"/>
         <w:numPr>
           <w:ilvl w:val="0"/>
           <w:numId w:val="1014"/>
         </w:numPr>
-        <w:pStyle w:val="Compact"/>
       </w:pPr>
       <m:oMath>
         <m:r>
@@ -9152,11 +8984,11 @@
     </w:p>
     <w:p>
       <w:pPr>
+        <w:pStyle w:val="Compact"/>
         <w:numPr>
           <w:ilvl w:val="0"/>
           <w:numId w:val="1014"/>
         </w:numPr>
-        <w:pStyle w:val="Compact"/>
       </w:pPr>
       <m:oMath>
         <m:r>
@@ -9187,11 +9019,11 @@
     </w:p>
     <w:p>
       <w:pPr>
+        <w:pStyle w:val="Compact"/>
         <w:numPr>
           <w:ilvl w:val="0"/>
           <w:numId w:val="1014"/>
         </w:numPr>
-        <w:pStyle w:val="Compact"/>
       </w:pPr>
       <m:oMath>
         <m:r>
@@ -9216,11 +9048,11 @@
     </w:p>
     <w:p>
       <w:pPr>
+        <w:pStyle w:val="Compact"/>
         <w:numPr>
           <w:ilvl w:val="0"/>
           <w:numId w:val="1014"/>
         </w:numPr>
-        <w:pStyle w:val="Compact"/>
       </w:pPr>
       <m:oMath>
         <m:r>
@@ -9245,11 +9077,11 @@
     </w:p>
     <w:p>
       <w:pPr>
+        <w:pStyle w:val="Compact"/>
         <w:numPr>
           <w:ilvl w:val="0"/>
           <w:numId w:val="1014"/>
         </w:numPr>
-        <w:pStyle w:val="Compact"/>
       </w:pPr>
       <m:oMath>
         <m:r>
@@ -9274,11 +9106,11 @@
     </w:p>
     <w:p>
       <w:pPr>
+        <w:pStyle w:val="Compact"/>
         <w:numPr>
           <w:ilvl w:val="0"/>
           <w:numId w:val="1014"/>
         </w:numPr>
-        <w:pStyle w:val="Compact"/>
       </w:pPr>
       <m:oMath>
         <m:r>
@@ -9303,11 +9135,11 @@
     </w:p>
     <w:p>
       <w:pPr>
+        <w:pStyle w:val="Compact"/>
         <w:numPr>
           <w:ilvl w:val="0"/>
           <w:numId w:val="1014"/>
         </w:numPr>
-        <w:pStyle w:val="Compact"/>
       </w:pPr>
       <m:oMath>
         <m:r>
@@ -9338,11 +9170,11 @@
     </w:p>
     <w:p>
       <w:pPr>
+        <w:pStyle w:val="Compact"/>
         <w:numPr>
           <w:ilvl w:val="0"/>
           <w:numId w:val="1014"/>
         </w:numPr>
-        <w:pStyle w:val="Compact"/>
       </w:pPr>
       <m:oMath>
         <m:r>
@@ -9379,11 +9211,11 @@
     </w:p>
     <w:p>
       <w:pPr>
+        <w:pStyle w:val="Compact"/>
         <w:numPr>
           <w:ilvl w:val="0"/>
           <w:numId w:val="1014"/>
         </w:numPr>
-        <w:pStyle w:val="Compact"/>
       </w:pPr>
       <m:oMath>
         <m:r>
@@ -9408,11 +9240,11 @@
     </w:p>
     <w:p>
       <w:pPr>
+        <w:pStyle w:val="Compact"/>
         <w:numPr>
           <w:ilvl w:val="0"/>
           <w:numId w:val="1014"/>
         </w:numPr>
-        <w:pStyle w:val="Compact"/>
       </w:pPr>
       <m:oMath>
         <m:r>
@@ -9437,11 +9269,11 @@
     </w:p>
     <w:p>
       <w:pPr>
+        <w:pStyle w:val="Compact"/>
         <w:numPr>
           <w:ilvl w:val="0"/>
           <w:numId w:val="1014"/>
         </w:numPr>
-        <w:pStyle w:val="Compact"/>
       </w:pPr>
       <m:oMath>
         <m:r>
@@ -9747,8 +9579,8 @@
       </w:pPr>
       <w:r>
         <w:rPr>
+          <w:b/>
           <w:bCs/>
-          <w:b/>
         </w:rPr>
         <w:t xml:space="preserve">Übungsaufgabe 11 (Berechne!)</w:t>
       </w:r>
@@ -9761,11 +9593,11 @@
     </w:p>
     <w:p>
       <w:pPr>
+        <w:pStyle w:val="Compact"/>
         <w:numPr>
           <w:ilvl w:val="0"/>
           <w:numId w:val="1015"/>
         </w:numPr>
-        <w:pStyle w:val="Compact"/>
       </w:pPr>
       <m:oMath>
         <m:r>
@@ -9802,11 +9634,11 @@
     </w:p>
     <w:p>
       <w:pPr>
+        <w:pStyle w:val="Compact"/>
         <w:numPr>
           <w:ilvl w:val="0"/>
           <w:numId w:val="1015"/>
         </w:numPr>
-        <w:pStyle w:val="Compact"/>
       </w:pPr>
       <m:oMath>
         <m:r>
@@ -9837,11 +9669,11 @@
     </w:p>
     <w:p>
       <w:pPr>
+        <w:pStyle w:val="Compact"/>
         <w:numPr>
           <w:ilvl w:val="0"/>
           <w:numId w:val="1015"/>
         </w:numPr>
-        <w:pStyle w:val="Compact"/>
       </w:pPr>
       <m:oMath>
         <m:r>
@@ -9878,11 +9710,11 @@
     </w:p>
     <w:p>
       <w:pPr>
+        <w:pStyle w:val="Compact"/>
         <w:numPr>
           <w:ilvl w:val="0"/>
           <w:numId w:val="1015"/>
         </w:numPr>
-        <w:pStyle w:val="Compact"/>
       </w:pPr>
       <m:oMath>
         <m:r>
@@ -9913,11 +9745,11 @@
     </w:p>
     <w:p>
       <w:pPr>
+        <w:pStyle w:val="Compact"/>
         <w:numPr>
           <w:ilvl w:val="0"/>
           <w:numId w:val="1015"/>
         </w:numPr>
-        <w:pStyle w:val="Compact"/>
       </w:pPr>
       <m:oMath>
         <m:r>
@@ -9948,11 +9780,11 @@
     </w:p>
     <w:p>
       <w:pPr>
+        <w:pStyle w:val="Compact"/>
         <w:numPr>
           <w:ilvl w:val="0"/>
           <w:numId w:val="1015"/>
         </w:numPr>
-        <w:pStyle w:val="Compact"/>
       </w:pPr>
       <m:oMath>
         <m:r>
@@ -9983,11 +9815,11 @@
     </w:p>
     <w:p>
       <w:pPr>
+        <w:pStyle w:val="Compact"/>
         <w:numPr>
           <w:ilvl w:val="0"/>
           <w:numId w:val="1015"/>
         </w:numPr>
-        <w:pStyle w:val="Compact"/>
       </w:pPr>
       <m:oMath>
         <m:r>
@@ -10012,11 +9844,11 @@
     </w:p>
     <w:p>
       <w:pPr>
+        <w:pStyle w:val="Compact"/>
         <w:numPr>
           <w:ilvl w:val="0"/>
           <w:numId w:val="1015"/>
         </w:numPr>
-        <w:pStyle w:val="Compact"/>
       </w:pPr>
       <m:oMath>
         <m:r>
@@ -10041,11 +9873,11 @@
     </w:p>
     <w:p>
       <w:pPr>
+        <w:pStyle w:val="Compact"/>
         <w:numPr>
           <w:ilvl w:val="0"/>
           <w:numId w:val="1015"/>
         </w:numPr>
-        <w:pStyle w:val="Compact"/>
       </w:pPr>
       <m:oMath>
         <m:r>
@@ -10070,11 +9902,11 @@
     </w:p>
     <w:p>
       <w:pPr>
+        <w:pStyle w:val="Compact"/>
         <w:numPr>
           <w:ilvl w:val="0"/>
           <w:numId w:val="1015"/>
         </w:numPr>
-        <w:pStyle w:val="Compact"/>
       </w:pPr>
       <m:oMath>
         <m:r>
@@ -10111,11 +9943,11 @@
     </w:p>
     <w:p>
       <w:pPr>
+        <w:pStyle w:val="Compact"/>
         <w:numPr>
           <w:ilvl w:val="0"/>
           <w:numId w:val="1015"/>
         </w:numPr>
-        <w:pStyle w:val="Compact"/>
       </w:pPr>
       <m:oMath>
         <m:r>
@@ -10146,11 +9978,11 @@
     </w:p>
     <w:p>
       <w:pPr>
+        <w:pStyle w:val="Compact"/>
         <w:numPr>
           <w:ilvl w:val="0"/>
           <w:numId w:val="1015"/>
         </w:numPr>
-        <w:pStyle w:val="Compact"/>
       </w:pPr>
       <m:oMath>
         <m:r>
@@ -10175,11 +10007,11 @@
     </w:p>
     <w:p>
       <w:pPr>
+        <w:pStyle w:val="Compact"/>
         <w:numPr>
           <w:ilvl w:val="0"/>
           <w:numId w:val="1015"/>
         </w:numPr>
-        <w:pStyle w:val="Compact"/>
       </w:pPr>
       <m:oMath>
         <m:r>
@@ -10210,11 +10042,11 @@
     </w:p>
     <w:p>
       <w:pPr>
+        <w:pStyle w:val="Compact"/>
         <w:numPr>
           <w:ilvl w:val="0"/>
           <w:numId w:val="1015"/>
         </w:numPr>
-        <w:pStyle w:val="Compact"/>
       </w:pPr>
       <m:oMath>
         <m:r>
@@ -10239,11 +10071,11 @@
     </w:p>
     <w:p>
       <w:pPr>
+        <w:pStyle w:val="Compact"/>
         <w:numPr>
           <w:ilvl w:val="0"/>
           <w:numId w:val="1015"/>
         </w:numPr>
-        <w:pStyle w:val="Compact"/>
       </w:pPr>
       <m:oMath>
         <m:r>
@@ -10280,8 +10112,8 @@
       </w:pPr>
       <w:r>
         <w:rPr>
+          <w:b/>
           <w:bCs/>
-          <w:b/>
         </w:rPr>
         <w:t xml:space="preserve">Übungsaufgabe 12 (Vermischte Aufgaben)</w:t>
       </w:r>
@@ -10294,11 +10126,11 @@
     </w:p>
     <w:p>
       <w:pPr>
+        <w:pStyle w:val="Compact"/>
         <w:numPr>
           <w:ilvl w:val="0"/>
           <w:numId w:val="1016"/>
         </w:numPr>
-        <w:pStyle w:val="Compact"/>
       </w:pPr>
       <m:oMath>
         <m:r>
@@ -10329,11 +10161,11 @@
     </w:p>
     <w:p>
       <w:pPr>
+        <w:pStyle w:val="Compact"/>
         <w:numPr>
           <w:ilvl w:val="0"/>
           <w:numId w:val="1016"/>
         </w:numPr>
-        <w:pStyle w:val="Compact"/>
       </w:pPr>
       <m:oMath>
         <m:r>
@@ -10364,11 +10196,11 @@
     </w:p>
     <w:p>
       <w:pPr>
+        <w:pStyle w:val="Compact"/>
         <w:numPr>
           <w:ilvl w:val="0"/>
           <w:numId w:val="1016"/>
         </w:numPr>
-        <w:pStyle w:val="Compact"/>
       </w:pPr>
       <m:oMath>
         <m:r>
@@ -10405,11 +10237,11 @@
     </w:p>
     <w:p>
       <w:pPr>
+        <w:pStyle w:val="Compact"/>
         <w:numPr>
           <w:ilvl w:val="0"/>
           <w:numId w:val="1016"/>
         </w:numPr>
-        <w:pStyle w:val="Compact"/>
       </w:pPr>
       <m:oMath>
         <m:r>
@@ -10446,11 +10278,11 @@
     </w:p>
     <w:p>
       <w:pPr>
+        <w:pStyle w:val="Compact"/>
         <w:numPr>
           <w:ilvl w:val="0"/>
           <w:numId w:val="1016"/>
         </w:numPr>
-        <w:pStyle w:val="Compact"/>
       </w:pPr>
       <m:oMath>
         <m:r>
@@ -10481,11 +10313,11 @@
     </w:p>
     <w:p>
       <w:pPr>
+        <w:pStyle w:val="Compact"/>
         <w:numPr>
           <w:ilvl w:val="0"/>
           <w:numId w:val="1016"/>
         </w:numPr>
-        <w:pStyle w:val="Compact"/>
       </w:pPr>
       <m:oMath>
         <m:r>
@@ -10510,11 +10342,11 @@
     </w:p>
     <w:p>
       <w:pPr>
+        <w:pStyle w:val="Compact"/>
         <w:numPr>
           <w:ilvl w:val="0"/>
           <w:numId w:val="1016"/>
         </w:numPr>
-        <w:pStyle w:val="Compact"/>
       </w:pPr>
       <m:oMath>
         <m:r>
@@ -10545,11 +10377,11 @@
     </w:p>
     <w:p>
       <w:pPr>
+        <w:pStyle w:val="Compact"/>
         <w:numPr>
           <w:ilvl w:val="0"/>
           <w:numId w:val="1016"/>
         </w:numPr>
-        <w:pStyle w:val="Compact"/>
       </w:pPr>
       <m:oMath>
         <m:r>
@@ -10586,11 +10418,11 @@
     </w:p>
     <w:p>
       <w:pPr>
+        <w:pStyle w:val="Compact"/>
         <w:numPr>
           <w:ilvl w:val="0"/>
           <w:numId w:val="1016"/>
         </w:numPr>
-        <w:pStyle w:val="Compact"/>
       </w:pPr>
       <m:oMath>
         <m:r>
@@ -10621,11 +10453,11 @@
     </w:p>
     <w:p>
       <w:pPr>
+        <w:pStyle w:val="Compact"/>
         <w:numPr>
           <w:ilvl w:val="0"/>
           <w:numId w:val="1016"/>
         </w:numPr>
-        <w:pStyle w:val="Compact"/>
       </w:pPr>
       <m:oMath>
         <m:r>
@@ -10650,11 +10482,11 @@
     </w:p>
     <w:p>
       <w:pPr>
+        <w:pStyle w:val="Compact"/>
         <w:numPr>
           <w:ilvl w:val="0"/>
           <w:numId w:val="1016"/>
         </w:numPr>
-        <w:pStyle w:val="Compact"/>
       </w:pPr>
       <m:oMath>
         <m:r>
@@ -10685,11 +10517,11 @@
     </w:p>
     <w:p>
       <w:pPr>
+        <w:pStyle w:val="Compact"/>
         <w:numPr>
           <w:ilvl w:val="0"/>
           <w:numId w:val="1016"/>
         </w:numPr>
-        <w:pStyle w:val="Compact"/>
       </w:pPr>
       <m:oMath>
         <m:r>
@@ -10720,11 +10552,11 @@
     </w:p>
     <w:p>
       <w:pPr>
+        <w:pStyle w:val="Compact"/>
         <w:numPr>
           <w:ilvl w:val="0"/>
           <w:numId w:val="1016"/>
         </w:numPr>
-        <w:pStyle w:val="Compact"/>
       </w:pPr>
       <m:oMath>
         <m:r>
@@ -10749,11 +10581,11 @@
     </w:p>
     <w:p>
       <w:pPr>
+        <w:pStyle w:val="Compact"/>
         <w:numPr>
           <w:ilvl w:val="0"/>
           <w:numId w:val="1016"/>
         </w:numPr>
-        <w:pStyle w:val="Compact"/>
       </w:pPr>
       <m:oMath>
         <m:r>
@@ -10790,11 +10622,11 @@
     </w:p>
     <w:p>
       <w:pPr>
+        <w:pStyle w:val="Compact"/>
         <w:numPr>
           <w:ilvl w:val="0"/>
           <w:numId w:val="1016"/>
         </w:numPr>
-        <w:pStyle w:val="Compact"/>
       </w:pPr>
       <m:oMath>
         <m:r>
@@ -10825,11 +10657,11 @@
     </w:p>
     <w:p>
       <w:pPr>
+        <w:pStyle w:val="Compact"/>
         <w:numPr>
           <w:ilvl w:val="0"/>
           <w:numId w:val="1016"/>
         </w:numPr>
-        <w:pStyle w:val="Compact"/>
       </w:pPr>
       <m:oMath>
         <m:r>
@@ -10866,11 +10698,11 @@
     </w:p>
     <w:p>
       <w:pPr>
+        <w:pStyle w:val="Compact"/>
         <w:numPr>
           <w:ilvl w:val="0"/>
           <w:numId w:val="1016"/>
         </w:numPr>
-        <w:pStyle w:val="Compact"/>
       </w:pPr>
       <m:oMath>
         <m:r>
@@ -10901,11 +10733,11 @@
     </w:p>
     <w:p>
       <w:pPr>
+        <w:pStyle w:val="Compact"/>
         <w:numPr>
           <w:ilvl w:val="0"/>
           <w:numId w:val="1016"/>
         </w:numPr>
-        <w:pStyle w:val="Compact"/>
       </w:pPr>
       <m:oMath>
         <m:r>
@@ -10930,11 +10762,11 @@
     </w:p>
     <w:p>
       <w:pPr>
+        <w:pStyle w:val="Compact"/>
         <w:numPr>
           <w:ilvl w:val="0"/>
           <w:numId w:val="1016"/>
         </w:numPr>
-        <w:pStyle w:val="Compact"/>
       </w:pPr>
       <m:oMath>
         <m:r>
@@ -10971,11 +10803,11 @@
     </w:p>
     <w:p>
       <w:pPr>
+        <w:pStyle w:val="Compact"/>
         <w:numPr>
           <w:ilvl w:val="0"/>
           <w:numId w:val="1016"/>
         </w:numPr>
-        <w:pStyle w:val="Compact"/>
       </w:pPr>
       <m:oMath>
         <m:r>
@@ -11012,11 +10844,11 @@
     </w:p>
     <w:p>
       <w:pPr>
+        <w:pStyle w:val="Compact"/>
         <w:numPr>
           <w:ilvl w:val="0"/>
           <w:numId w:val="1016"/>
         </w:numPr>
-        <w:pStyle w:val="Compact"/>
       </w:pPr>
       <m:oMath>
         <m:r>
@@ -11047,11 +10879,11 @@
     </w:p>
     <w:p>
       <w:pPr>
+        <w:pStyle w:val="Compact"/>
         <w:numPr>
           <w:ilvl w:val="0"/>
           <w:numId w:val="1016"/>
         </w:numPr>
-        <w:pStyle w:val="Compact"/>
       </w:pPr>
       <m:oMath>
         <m:r>
@@ -11076,11 +10908,11 @@
     </w:p>
     <w:p>
       <w:pPr>
+        <w:pStyle w:val="Compact"/>
         <w:numPr>
           <w:ilvl w:val="0"/>
           <w:numId w:val="1016"/>
         </w:numPr>
-        <w:pStyle w:val="Compact"/>
       </w:pPr>
       <m:oMath>
         <m:r>
@@ -11117,11 +10949,11 @@
     </w:p>
     <w:p>
       <w:pPr>
+        <w:pStyle w:val="Compact"/>
         <w:numPr>
           <w:ilvl w:val="0"/>
           <w:numId w:val="1016"/>
         </w:numPr>
-        <w:pStyle w:val="Compact"/>
       </w:pPr>
       <m:oMath>
         <m:r>
@@ -11152,11 +10984,11 @@
     </w:p>
     <w:p>
       <w:pPr>
+        <w:pStyle w:val="Compact"/>
         <w:numPr>
           <w:ilvl w:val="0"/>
           <w:numId w:val="1016"/>
         </w:numPr>
-        <w:pStyle w:val="Compact"/>
       </w:pPr>
       <m:oMath>
         <m:r>
@@ -11187,11 +11019,11 @@
     </w:p>
     <w:p>
       <w:pPr>
+        <w:pStyle w:val="Compact"/>
         <w:numPr>
           <w:ilvl w:val="0"/>
           <w:numId w:val="1016"/>
         </w:numPr>
-        <w:pStyle w:val="Compact"/>
       </w:pPr>
       <m:oMath>
         <m:r>
@@ -11222,11 +11054,11 @@
     </w:p>
     <w:p>
       <w:pPr>
+        <w:pStyle w:val="Compact"/>
         <w:numPr>
           <w:ilvl w:val="0"/>
           <w:numId w:val="1016"/>
         </w:numPr>
-        <w:pStyle w:val="Compact"/>
       </w:pPr>
       <m:oMath>
         <m:r>
@@ -11263,8 +11095,8 @@
       </w:pPr>
       <w:r>
         <w:rPr>
+          <w:b/>
           <w:bCs/>
-          <w:b/>
         </w:rPr>
         <w:t xml:space="preserve">Übungsaufgabe 13</w:t>
       </w:r>
@@ -11344,8 +11176,8 @@
       </w:pPr>
       <w:r>
         <w:rPr>
+          <w:b/>
           <w:bCs/>
-          <w:b/>
         </w:rPr>
         <w:t xml:space="preserve">Übungsaufgabe 14</w:t>
       </w:r>
@@ -11419,8 +11251,8 @@
       </w:pPr>
       <w:r>
         <w:rPr>
+          <w:b/>
           <w:bCs/>
-          <w:b/>
         </w:rPr>
         <w:t xml:space="preserve">Übungsaufgabe 15 (Berechne!)</w:t>
       </w:r>
@@ -11433,11 +11265,11 @@
     </w:p>
     <w:p>
       <w:pPr>
+        <w:pStyle w:val="Compact"/>
         <w:numPr>
           <w:ilvl w:val="0"/>
           <w:numId w:val="1017"/>
         </w:numPr>
-        <w:pStyle w:val="Compact"/>
       </w:pPr>
       <m:oMath>
         <m:d>
@@ -11503,11 +11335,11 @@
     </w:p>
     <w:p>
       <w:pPr>
+        <w:pStyle w:val="Compact"/>
         <w:numPr>
           <w:ilvl w:val="0"/>
           <w:numId w:val="1017"/>
         </w:numPr>
-        <w:pStyle w:val="Compact"/>
       </w:pPr>
       <m:oMath>
         <m:d>
@@ -11589,11 +11421,11 @@
     </w:p>
     <w:p>
       <w:pPr>
+        <w:pStyle w:val="Compact"/>
         <w:numPr>
           <w:ilvl w:val="0"/>
           <w:numId w:val="1017"/>
         </w:numPr>
-        <w:pStyle w:val="Compact"/>
       </w:pPr>
       <m:oMath>
         <m:r>
@@ -11649,11 +11481,11 @@
     </w:p>
     <w:p>
       <w:pPr>
+        <w:pStyle w:val="Compact"/>
         <w:numPr>
           <w:ilvl w:val="0"/>
           <w:numId w:val="1017"/>
         </w:numPr>
-        <w:pStyle w:val="Compact"/>
       </w:pPr>
       <m:oMath>
         <m:d>
@@ -11719,11 +11551,11 @@
     </w:p>
     <w:p>
       <w:pPr>
+        <w:pStyle w:val="Compact"/>
         <w:numPr>
           <w:ilvl w:val="0"/>
           <w:numId w:val="1017"/>
         </w:numPr>
-        <w:pStyle w:val="Compact"/>
       </w:pPr>
       <m:oMath>
         <m:r>
@@ -11779,11 +11611,11 @@
     </w:p>
     <w:p>
       <w:pPr>
+        <w:pStyle w:val="Compact"/>
         <w:numPr>
           <w:ilvl w:val="0"/>
           <w:numId w:val="1017"/>
         </w:numPr>
-        <w:pStyle w:val="Compact"/>
       </w:pPr>
       <m:oMath>
         <m:r>
@@ -11839,11 +11671,11 @@
     </w:p>
     <w:p>
       <w:pPr>
+        <w:pStyle w:val="Compact"/>
         <w:numPr>
           <w:ilvl w:val="0"/>
           <w:numId w:val="1017"/>
         </w:numPr>
-        <w:pStyle w:val="Compact"/>
       </w:pPr>
       <m:oMath>
         <m:d>
@@ -11909,11 +11741,11 @@
     </w:p>
     <w:p>
       <w:pPr>
+        <w:pStyle w:val="Compact"/>
         <w:numPr>
           <w:ilvl w:val="0"/>
           <w:numId w:val="1017"/>
         </w:numPr>
-        <w:pStyle w:val="Compact"/>
       </w:pPr>
       <m:oMath>
         <m:r>
@@ -11985,11 +11817,11 @@
     </w:p>
     <w:p>
       <w:pPr>
+        <w:pStyle w:val="Compact"/>
         <w:numPr>
           <w:ilvl w:val="0"/>
           <w:numId w:val="1017"/>
         </w:numPr>
-        <w:pStyle w:val="Compact"/>
       </w:pPr>
       <m:oMath>
         <m:r>
@@ -12055,11 +11887,11 @@
     </w:p>
     <w:p>
       <w:pPr>
+        <w:pStyle w:val="Compact"/>
         <w:numPr>
           <w:ilvl w:val="0"/>
           <w:numId w:val="1017"/>
         </w:numPr>
-        <w:pStyle w:val="Compact"/>
       </w:pPr>
       <m:oMath>
         <m:r>
@@ -12115,11 +11947,11 @@
     </w:p>
     <w:p>
       <w:pPr>
+        <w:pStyle w:val="Compact"/>
         <w:numPr>
           <w:ilvl w:val="0"/>
           <w:numId w:val="1017"/>
         </w:numPr>
-        <w:pStyle w:val="Compact"/>
       </w:pPr>
       <m:oMath>
         <m:r>
@@ -12185,11 +12017,11 @@
     </w:p>
     <w:p>
       <w:pPr>
+        <w:pStyle w:val="Compact"/>
         <w:numPr>
           <w:ilvl w:val="0"/>
           <w:numId w:val="1017"/>
         </w:numPr>
-        <w:pStyle w:val="Compact"/>
       </w:pPr>
       <m:oMath>
         <m:d>
@@ -12271,11 +12103,11 @@
     </w:p>
     <w:p>
       <w:pPr>
+        <w:pStyle w:val="Compact"/>
         <w:numPr>
           <w:ilvl w:val="0"/>
           <w:numId w:val="1017"/>
         </w:numPr>
-        <w:pStyle w:val="Compact"/>
       </w:pPr>
       <m:oMath>
         <m:r>
@@ -12331,11 +12163,11 @@
     </w:p>
     <w:p>
       <w:pPr>
+        <w:pStyle w:val="Compact"/>
         <w:numPr>
           <w:ilvl w:val="0"/>
           <w:numId w:val="1017"/>
         </w:numPr>
-        <w:pStyle w:val="Compact"/>
       </w:pPr>
       <m:oMath>
         <m:d>
@@ -12401,8 +12233,8 @@
       </w:pPr>
       <w:r>
         <w:rPr>
+          <w:b/>
           <w:bCs/>
-          <w:b/>
         </w:rPr>
         <w:t xml:space="preserve">Übungsaufgabe 16</w:t>
       </w:r>
@@ -12421,11 +12253,11 @@
     </w:p>
     <w:p>
       <w:pPr>
+        <w:pStyle w:val="Compact"/>
         <w:numPr>
           <w:ilvl w:val="0"/>
           <w:numId w:val="1018"/>
         </w:numPr>
-        <w:pStyle w:val="Compact"/>
       </w:pPr>
       <w:r>
         <w:t xml:space="preserve">Wie viel Geld hat Tom nach der Mietzahlung?</w:t>
@@ -12433,11 +12265,11 @@
     </w:p>
     <w:p>
       <w:pPr>
+        <w:pStyle w:val="Compact"/>
         <w:numPr>
           <w:ilvl w:val="0"/>
           <w:numId w:val="1018"/>
         </w:numPr>
-        <w:pStyle w:val="Compact"/>
       </w:pPr>
       <w:r>
         <w:t xml:space="preserve">Tom verdient am nächsten Tag 80 Franken. Wie viel Geld hat er jetzt?</w:t>
@@ -12451,8 +12283,8 @@
       </w:pPr>
       <w:r>
         <w:rPr>
+          <w:b/>
           <w:bCs/>
-          <w:b/>
         </w:rPr>
         <w:t xml:space="preserve">Übungsaufgabe 17</w:t>
       </w:r>
@@ -12477,11 +12309,11 @@
     </w:p>
     <w:p>
       <w:pPr>
+        <w:pStyle w:val="Compact"/>
         <w:numPr>
           <w:ilvl w:val="0"/>
           <w:numId w:val="1019"/>
         </w:numPr>
-        <w:pStyle w:val="Compact"/>
       </w:pPr>
       <w:r>
         <w:t xml:space="preserve">Wie viele Punkte hat Lukas insgesamt durch die richtigen Antworten gesammelt?</w:t>
@@ -12489,11 +12321,11 @@
     </w:p>
     <w:p>
       <w:pPr>
+        <w:pStyle w:val="Compact"/>
         <w:numPr>
           <w:ilvl w:val="0"/>
           <w:numId w:val="1019"/>
         </w:numPr>
-        <w:pStyle w:val="Compact"/>
       </w:pPr>
       <w:r>
         <w:t xml:space="preserve">Wie viele Punkte hat Lukas insgesamt durch die falschen Antworten verloren?</w:t>
@@ -12501,11 +12333,11 @@
     </w:p>
     <w:p>
       <w:pPr>
+        <w:pStyle w:val="Compact"/>
         <w:numPr>
           <w:ilvl w:val="0"/>
           <w:numId w:val="1019"/>
         </w:numPr>
-        <w:pStyle w:val="Compact"/>
       </w:pPr>
       <w:r>
         <w:t xml:space="preserve">Wie viele Punkte hat Lukas am Ende insgesamt?</w:t>
@@ -12519,8 +12351,8 @@
       </w:pPr>
       <w:r>
         <w:rPr>
+          <w:b/>
           <w:bCs/>
-          <w:b/>
         </w:rPr>
         <w:t xml:space="preserve">Übungsaufgabe 18</w:t>
       </w:r>
@@ -12551,8 +12383,8 @@
       </w:pPr>
       <w:r>
         <w:rPr>
+          <w:b/>
           <w:bCs/>
-          <w:b/>
         </w:rPr>
         <w:t xml:space="preserve">Übungsaufgabe 19</w:t>
       </w:r>
@@ -12899,11 +12731,11 @@
           </w:p>
           <w:p>
             <w:pPr>
+              <w:pStyle w:val="Compact"/>
               <w:numPr>
                 <w:ilvl w:val="0"/>
                 <w:numId w:val="1020"/>
               </w:numPr>
-              <w:pStyle w:val="Compact"/>
             </w:pPr>
             <w:r>
               <w:t xml:space="preserve">Schüler verwechseln das Minuszeichen als Teil einer Zahl (z.B. -3) mit dem Minuszeichen als Subtraktionsoperator (z.B. 7 - 3).</w:t>
@@ -12911,11 +12743,11 @@
           </w:p>
           <w:p>
             <w:pPr>
+              <w:pStyle w:val="Compact"/>
               <w:numPr>
                 <w:ilvl w:val="1"/>
                 <w:numId w:val="1021"/>
               </w:numPr>
-              <w:pStyle w:val="Compact"/>
             </w:pPr>
             <w:r>
               <w:t xml:space="preserve">Von Beginn an konsequent klare Bezeichnungen verwenden: «negativ» für das Vorzeichen und «minus» für die Subtraktion. Evtl. können farbliche Markierungen helfen die Unterscheidung deutlicher</w:t>
@@ -12929,11 +12761,11 @@
           </w:p>
           <w:p>
             <w:pPr>
+              <w:pStyle w:val="Compact"/>
               <w:numPr>
                 <w:ilvl w:val="0"/>
                 <w:numId w:val="1020"/>
               </w:numPr>
-              <w:pStyle w:val="Compact"/>
             </w:pPr>
             <w:r>
               <w:t xml:space="preserve">Schwierigkeiten zu verstehen, dass das Subtrahieren einer negativen Zahl das Gleiche ist wie das Addieren der positiven Zahl (z.B. 5−(−3) = 5+3)</w:t>
@@ -12941,11 +12773,11 @@
           </w:p>
           <w:p>
             <w:pPr>
+              <w:pStyle w:val="Compact"/>
               <w:numPr>
                 <w:ilvl w:val="1"/>
                 <w:numId w:val="1022"/>
               </w:numPr>
-              <w:pStyle w:val="Compact"/>
             </w:pPr>
             <w:r>
               <w:t xml:space="preserve">Einführung des Merksatzes: «Minus und Minus gibt Plus». Zu Beginn ist es sicherlich sinnvoll Aufgaben mit Hilfe des Zahlenstrahls zu lösen, um sich die Merkregel zu verinnerlichen. Hierbei ist</w:t>
@@ -12959,11 +12791,11 @@
           </w:p>
           <w:p>
             <w:pPr>
+              <w:pStyle w:val="Compact"/>
               <w:numPr>
                 <w:ilvl w:val="0"/>
                 <w:numId w:val="1020"/>
               </w:numPr>
-              <w:pStyle w:val="Compact"/>
             </w:pPr>
             <w:r>
               <w:t xml:space="preserve">Vorzeichenwechsel bei Multiplikation und Division –&gt; (−2)×(−3) = 6 oder (−4)÷(−2) = 2</w:t>
@@ -12971,11 +12803,11 @@
           </w:p>
           <w:p>
             <w:pPr>
+              <w:pStyle w:val="Compact"/>
               <w:numPr>
                 <w:ilvl w:val="1"/>
                 <w:numId w:val="1023"/>
               </w:numPr>
-              <w:pStyle w:val="Compact"/>
             </w:pPr>
             <w:r>
               <w:t xml:space="preserve">Den genauen Sachverhalt, kann den SuS durch konkrete Beispiele vor Augen geführt werden. Das Prinzip muss mit den SuS umfassend aufarbeitet werden, sodass sie sich darauf einlassen können</w:t>
@@ -12989,11 +12821,11 @@
           </w:p>
           <w:p>
             <w:pPr>
+              <w:pStyle w:val="Compact"/>
               <w:numPr>
                 <w:ilvl w:val="0"/>
                 <w:numId w:val="1020"/>
               </w:numPr>
-              <w:pStyle w:val="Compact"/>
             </w:pPr>
             <w:r>
               <w:t xml:space="preserve">Schüler neigen dazu, größere negative Zahlen als „größer“ im positiven Sinne zu betrachten (z.B. denken, dass -5 größer ist als -2)</w:t>
@@ -13001,11 +12833,11 @@
           </w:p>
           <w:p>
             <w:pPr>
+              <w:pStyle w:val="Compact"/>
               <w:numPr>
                 <w:ilvl w:val="1"/>
                 <w:numId w:val="1024"/>
               </w:numPr>
-              <w:pStyle w:val="Compact"/>
             </w:pPr>
             <w:r>
               <w:t xml:space="preserve">Wiederholtes Üben: Aufgaben mit dem Zahlenstrahl lösen, um das Verständnis visuell zu verstärken. Zudem kann das Arbeiten mit bekannten Konzepten helfen ein tieferes Verständnis aufzubauen:</w:t>
@@ -13019,11 +12851,11 @@
           </w:p>
           <w:p>
             <w:pPr>
+              <w:pStyle w:val="Compact"/>
               <w:numPr>
                 <w:ilvl w:val="0"/>
                 <w:numId w:val="1020"/>
               </w:numPr>
-              <w:pStyle w:val="Compact"/>
             </w:pPr>
             <w:r>
               <w:t xml:space="preserve">Einige Schüler haben eine Angst vor negativen Zahlen oder glauben, dass sie schwer zu verstehen sind, was ihr Lernen blockiert.</w:t>
@@ -13031,11 +12863,11 @@
           </w:p>
           <w:p>
             <w:pPr>
+              <w:pStyle w:val="Compact"/>
               <w:numPr>
                 <w:ilvl w:val="1"/>
                 <w:numId w:val="1025"/>
               </w:numPr>
-              <w:pStyle w:val="Compact"/>
             </w:pPr>
             <w:r>
               <w:t xml:space="preserve">Die SuS können durch kleine Erfolgserlebnisse ermutigt werden. Zudem kann der spielerische Zugang an das Konzept den ersten Zugang wesentlich erleichtern und das Interesse an der Thematik</w:t>
@@ -13162,11 +12994,11 @@
           </w:tcPr>
           <w:p>
             <w:pPr>
+              <w:pStyle w:val="Compact"/>
               <w:numPr>
                 <w:ilvl w:val="0"/>
                 <w:numId w:val="1026"/>
               </w:numPr>
-              <w:pStyle w:val="Compact"/>
             </w:pPr>
             <w:r>
               <w:t xml:space="preserve">Natürliche Zahlen (1, 2, 3, …) sind bekannt</w:t>
@@ -13174,11 +13006,11 @@
           </w:p>
           <w:p>
             <w:pPr>
+              <w:pStyle w:val="Compact"/>
               <w:numPr>
                 <w:ilvl w:val="0"/>
                 <w:numId w:val="1026"/>
               </w:numPr>
-              <w:pStyle w:val="Compact"/>
             </w:pPr>
             <w:r>
               <w:t xml:space="preserve">Grundrechenarten (Addition, Subtraktion, Multiplikation und Division) sind bei den natürlichen Zahlen vertraut (werden beherrscht)</w:t>
@@ -13186,11 +13018,11 @@
           </w:p>
           <w:p>
             <w:pPr>
+              <w:pStyle w:val="Compact"/>
               <w:numPr>
                 <w:ilvl w:val="0"/>
                 <w:numId w:val="1026"/>
               </w:numPr>
-              <w:pStyle w:val="Compact"/>
             </w:pPr>
             <w:r>
               <w:t xml:space="preserve">Die Zahlengeraden (mindestens der Zahlenstrahl) wurde schon min. einmal gesehen–&gt; Zahlen sind in einer bestimmten Reihenfolge angeordnet</w:t>
@@ -13198,11 +13030,11 @@
           </w:p>
           <w:p>
             <w:pPr>
+              <w:pStyle w:val="Compact"/>
               <w:numPr>
                 <w:ilvl w:val="0"/>
                 <w:numId w:val="1026"/>
               </w:numPr>
-              <w:pStyle w:val="Compact"/>
             </w:pPr>
             <w:r>
               <w:t xml:space="preserve">Zahlen Vergleichen (&gt;, &lt;, =) können die SuS</w:t>
@@ -13210,11 +13042,11 @@
           </w:p>
           <w:p>
             <w:pPr>
+              <w:pStyle w:val="Compact"/>
               <w:numPr>
                 <w:ilvl w:val="0"/>
                 <w:numId w:val="1026"/>
               </w:numPr>
-              <w:pStyle w:val="Compact"/>
             </w:pPr>
             <w:r>
               <w:t xml:space="preserve">Schüler haben möglicherweise (mit ziemlicher Wahrscheinlichkeit) Erfahrungen mit Alltagssituationen gemacht, die negative Konzepte beinhalten</w:t>
@@ -13290,14 +13122,14 @@
 <file path=word/numbering.xml><?xml version="1.0" encoding="utf-8"?>
 <w:numbering xmlns:w="http://schemas.openxmlformats.org/wordprocessingml/2006/main">
   <w:abstractNum w:abstractNumId="990">
-    <w:nsid w:val="A990"/>
+    <w:nsid w:val="0000A990"/>
     <w:multiLevelType w:val="multilevel"/>
     <w:lvl w:ilvl="0">
       <w:numFmt w:val="bullet"/>
       <w:lvlText w:val=" "/>
       <w:lvlJc w:val="left"/>
       <w:pPr>
-        <w:ind w:left="720" w:hanging="480"/>
+        <w:ind w:left="720" w:hanging="360"/>
       </w:pPr>
     </w:lvl>
     <w:lvl w:ilvl="1">
@@ -13305,7 +13137,7 @@
       <w:lvlText w:val=" "/>
       <w:lvlJc w:val="left"/>
       <w:pPr>
-        <w:ind w:left="1440" w:hanging="480"/>
+        <w:ind w:left="1440" w:hanging="360"/>
       </w:pPr>
     </w:lvl>
     <w:lvl w:ilvl="2">
@@ -13313,7 +13145,7 @@
       <w:lvlText w:val=" "/>
       <w:lvlJc w:val="left"/>
       <w:pPr>
-        <w:ind w:left="2160" w:hanging="480"/>
+        <w:ind w:left="2160" w:hanging="360"/>
       </w:pPr>
     </w:lvl>
     <w:lvl w:ilvl="3">
@@ -13321,7 +13153,7 @@
       <w:lvlText w:val=" "/>
       <w:lvlJc w:val="left"/>
       <w:pPr>
-        <w:ind w:left="2880" w:hanging="480"/>
+        <w:ind w:left="2880" w:hanging="360"/>
       </w:pPr>
     </w:lvl>
     <w:lvl w:ilvl="4">
@@ -13329,7 +13161,7 @@
       <w:lvlText w:val=" "/>
       <w:lvlJc w:val="left"/>
       <w:pPr>
-        <w:ind w:left="3600" w:hanging="480"/>
+        <w:ind w:left="3600" w:hanging="360"/>
       </w:pPr>
     </w:lvl>
     <w:lvl w:ilvl="5">
@@ -13337,7 +13169,7 @@
       <w:lvlText w:val=" "/>
       <w:lvlJc w:val="left"/>
       <w:pPr>
-        <w:ind w:left="4320" w:hanging="480"/>
+        <w:ind w:left="4320" w:hanging="360"/>
       </w:pPr>
     </w:lvl>
     <w:lvl w:ilvl="6">
@@ -13345,7 +13177,7 @@
       <w:lvlText w:val=" "/>
       <w:lvlJc w:val="left"/>
       <w:pPr>
-        <w:ind w:left="5040" w:hanging="480"/>
+        <w:ind w:left="5040" w:hanging="360"/>
       </w:pPr>
     </w:lvl>
     <w:lvl w:ilvl="7">
@@ -13353,7 +13185,7 @@
       <w:lvlText w:val=" "/>
       <w:lvlJc w:val="left"/>
       <w:pPr>
-        <w:ind w:left="5760" w:hanging="480"/>
+        <w:ind w:left="5760" w:hanging="360"/>
       </w:pPr>
     </w:lvl>
     <w:lvl w:ilvl="8">
@@ -13361,12 +13193,12 @@
       <w:lvlText w:val=" "/>
       <w:lvlJc w:val="left"/>
       <w:pPr>
-        <w:ind w:left="6480" w:hanging="480"/>
+        <w:ind w:left="6480" w:hanging="360"/>
       </w:pPr>
     </w:lvl>
   </w:abstractNum>
   <w:abstractNum w:abstractNumId="99411">
-    <w:nsid w:val="A99411"/>
+    <w:nsid w:val="00A99411"/>
     <w:multiLevelType w:val="multilevel"/>
     <w:lvl w:ilvl="0">
       <w:start w:val="1"/>
@@ -13374,7 +13206,7 @@
       <w:lvlText w:val="%1."/>
       <w:lvlJc w:val="left"/>
       <w:pPr>
-        <w:ind w:left="720" w:hanging="480"/>
+        <w:ind w:left="720" w:hanging="360"/>
       </w:pPr>
     </w:lvl>
     <w:lvl w:ilvl="1">
@@ -13383,7 +13215,7 @@
       <w:lvlText w:val="%2."/>
       <w:lvlJc w:val="left"/>
       <w:pPr>
-        <w:ind w:left="1440" w:hanging="480"/>
+        <w:ind w:left="1440" w:hanging="360"/>
       </w:pPr>
     </w:lvl>
     <w:lvl w:ilvl="2">
@@ -13392,7 +13224,7 @@
       <w:lvlText w:val="%3."/>
       <w:lvlJc w:val="left"/>
       <w:pPr>
-        <w:ind w:left="2160" w:hanging="480"/>
+        <w:ind w:left="2160" w:hanging="360"/>
       </w:pPr>
     </w:lvl>
     <w:lvl w:ilvl="3">
@@ -13401,7 +13233,7 @@
       <w:lvlText w:val="%4."/>
       <w:lvlJc w:val="left"/>
       <w:pPr>
-        <w:ind w:left="2880" w:hanging="480"/>
+        <w:ind w:left="2880" w:hanging="360"/>
       </w:pPr>
     </w:lvl>
     <w:lvl w:ilvl="4">
@@ -13410,7 +13242,7 @@
       <w:lvlText w:val="%5."/>
       <w:lvlJc w:val="left"/>
       <w:pPr>
-        <w:ind w:left="3600" w:hanging="480"/>
+        <w:ind w:left="3600" w:hanging="360"/>
       </w:pPr>
     </w:lvl>
     <w:lvl w:ilvl="5">
@@ -13419,7 +13251,7 @@
       <w:lvlText w:val="%6."/>
       <w:lvlJc w:val="left"/>
       <w:pPr>
-        <w:ind w:left="4320" w:hanging="480"/>
+        <w:ind w:left="4320" w:hanging="360"/>
       </w:pPr>
     </w:lvl>
     <w:lvl w:ilvl="6">
@@ -13428,7 +13260,7 @@
       <w:lvlText w:val="%7."/>
       <w:lvlJc w:val="left"/>
       <w:pPr>
-        <w:ind w:left="5040" w:hanging="480"/>
+        <w:ind w:left="5040" w:hanging="360"/>
       </w:pPr>
     </w:lvl>
     <w:lvl w:ilvl="7">
@@ -13437,7 +13269,7 @@
       <w:lvlText w:val="%8."/>
       <w:lvlJc w:val="left"/>
       <w:pPr>
-        <w:ind w:left="5760" w:hanging="480"/>
+        <w:ind w:left="5760" w:hanging="360"/>
       </w:pPr>
     </w:lvl>
     <w:lvl w:ilvl="8">
@@ -13446,88 +13278,115 @@
       <w:lvlText w:val="%9."/>
       <w:lvlJc w:val="left"/>
       <w:pPr>
-        <w:ind w:left="6480" w:hanging="480"/>
+        <w:ind w:left="6480" w:hanging="360"/>
       </w:pPr>
     </w:lvl>
   </w:abstractNum>
   <w:abstractNum w:abstractNumId="991">
-    <w:nsid w:val="A991"/>
+    <w:nsid w:val="0000A991"/>
     <w:multiLevelType w:val="multilevel"/>
     <w:lvl w:ilvl="0">
       <w:numFmt w:val="bullet"/>
-      <w:lvlText w:val="•"/>
+      <w:lvlText w:val=""/>
       <w:lvlJc w:val="left"/>
       <w:pPr>
-        <w:ind w:left="720" w:hanging="480"/>
-      </w:pPr>
+        <w:ind w:left="720" w:hanging="360"/>
+      </w:pPr>
+      <w:rPr>
+        <w:rFonts w:ascii="Symbol" w:hAnsi="Symbol" w:cs="Symbol" w:hint="default"/>
+      </w:rPr>
     </w:lvl>
     <w:lvl w:ilvl="1">
       <w:numFmt w:val="bullet"/>
-      <w:lvlText w:val="–"/>
+      <w:lvlText w:val="o"/>
       <w:lvlJc w:val="left"/>
       <w:pPr>
-        <w:ind w:left="1440" w:hanging="480"/>
-      </w:pPr>
+        <w:ind w:left="1440" w:hanging="360"/>
+      </w:pPr>
+      <w:rPr>
+        <w:rFonts w:ascii="Courier New" w:hAnsi="Courier New" w:cs="Courier New" w:hint="default"/>
+      </w:rPr>
     </w:lvl>
     <w:lvl w:ilvl="2">
       <w:numFmt w:val="bullet"/>
-      <w:lvlText w:val="•"/>
+      <w:lvlText w:val=""/>
       <w:lvlJc w:val="left"/>
       <w:pPr>
-        <w:ind w:left="2160" w:hanging="480"/>
-      </w:pPr>
+        <w:ind w:left="2160" w:hanging="360"/>
+      </w:pPr>
+      <w:rPr>
+        <w:rFonts w:ascii="Wingdings" w:hAnsi="Wingdings" w:cs="Wingdings" w:hint="default"/>
+      </w:rPr>
     </w:lvl>
     <w:lvl w:ilvl="3">
       <w:numFmt w:val="bullet"/>
-      <w:lvlText w:val="–"/>
+      <w:lvlText w:val=""/>
       <w:lvlJc w:val="left"/>
       <w:pPr>
-        <w:ind w:left="2880" w:hanging="480"/>
-      </w:pPr>
+        <w:ind w:left="2880" w:hanging="360"/>
+      </w:pPr>
+      <w:rPr>
+        <w:rFonts w:ascii="Symbol" w:hAnsi="Symbol" w:cs="Symbol" w:hint="default"/>
+      </w:rPr>
     </w:lvl>
     <w:lvl w:ilvl="4">
       <w:numFmt w:val="bullet"/>
-      <w:lvlText w:val="•"/>
+      <w:lvlText w:val="o"/>
       <w:lvlJc w:val="left"/>
       <w:pPr>
-        <w:ind w:left="3600" w:hanging="480"/>
-      </w:pPr>
+        <w:ind w:left="3600" w:hanging="360"/>
+      </w:pPr>
+      <w:rPr>
+        <w:rFonts w:ascii="Courier New" w:hAnsi="Courier New" w:cs="Courier New" w:hint="default"/>
+      </w:rPr>
     </w:lvl>
     <w:lvl w:ilvl="5">
       <w:numFmt w:val="bullet"/>
-      <w:lvlText w:val="–"/>
+      <w:lvlText w:val=""/>
       <w:lvlJc w:val="left"/>
       <w:pPr>
-        <w:ind w:left="4320" w:hanging="480"/>
-      </w:pPr>
+        <w:ind w:left="4320" w:hanging="360"/>
+      </w:pPr>
+      <w:rPr>
+        <w:rFonts w:ascii="Wingdings" w:hAnsi="Wingdings" w:cs="Wingdings" w:hint="default"/>
+      </w:rPr>
     </w:lvl>
     <w:lvl w:ilvl="6">
       <w:numFmt w:val="bullet"/>
-      <w:lvlText w:val="•"/>
+      <w:lvlText w:val=""/>
       <w:lvlJc w:val="left"/>
       <w:pPr>
-        <w:ind w:left="5040" w:hanging="480"/>
-      </w:pPr>
+        <w:ind w:left="5040" w:hanging="360"/>
+      </w:pPr>
+      <w:rPr>
+        <w:rFonts w:ascii="Symbol" w:hAnsi="Symbol" w:cs="Symbol" w:hint="default"/>
+      </w:rPr>
     </w:lvl>
     <w:lvl w:ilvl="7">
       <w:numFmt w:val="bullet"/>
-      <w:lvlText w:val="–"/>
+      <w:lvlText w:val="o"/>
       <w:lvlJc w:val="left"/>
       <w:pPr>
-        <w:ind w:left="5760" w:hanging="480"/>
-      </w:pPr>
+        <w:ind w:left="5760" w:hanging="360"/>
+      </w:pPr>
+      <w:rPr>
+        <w:rFonts w:ascii="Courier New" w:hAnsi="Courier New" w:cs="Courier New" w:hint="default"/>
+      </w:rPr>
     </w:lvl>
     <w:lvl w:ilvl="8">
       <w:numFmt w:val="bullet"/>
-      <w:lvlText w:val="•"/>
+      <w:lvlText w:val=""/>
       <w:lvlJc w:val="left"/>
       <w:pPr>
-        <w:ind w:left="6480" w:hanging="480"/>
-      </w:pPr>
+        <w:ind w:left="6480" w:hanging="360"/>
+      </w:pPr>
+      <w:rPr>
+        <w:rFonts w:ascii="Wingdings" w:hAnsi="Wingdings" w:cs="Wingdings" w:hint="default"/>
+      </w:rPr>
     </w:lvl>
   </w:abstractNum>
   <w:abstractNum w:abstractNumId="99721">
-    <w:nsid w:val="A99721"/>
+    <w:nsid w:val="00A99721"/>
     <w:multiLevelType w:val="multilevel"/>
     <w:lvl w:ilvl="0">
       <w:start w:val="1"/>
@@ -13535,7 +13394,7 @@
       <w:lvlText w:val="%1)"/>
       <w:lvlJc w:val="left"/>
       <w:pPr>
-        <w:ind w:left="720" w:hanging="480"/>
+        <w:ind w:left="720" w:hanging="360"/>
       </w:pPr>
     </w:lvl>
     <w:lvl w:ilvl="1">
@@ -13544,7 +13403,7 @@
       <w:lvlText w:val="%2)"/>
       <w:lvlJc w:val="left"/>
       <w:pPr>
-        <w:ind w:left="1440" w:hanging="480"/>
+        <w:ind w:left="1440" w:hanging="360"/>
       </w:pPr>
     </w:lvl>
     <w:lvl w:ilvl="2">
@@ -13553,7 +13412,7 @@
       <w:lvlText w:val="%3)"/>
       <w:lvlJc w:val="left"/>
       <w:pPr>
-        <w:ind w:left="2160" w:hanging="480"/>
+        <w:ind w:left="2160" w:hanging="360"/>
       </w:pPr>
     </w:lvl>
     <w:lvl w:ilvl="3">
@@ -13562,7 +13421,7 @@
       <w:lvlText w:val="%4)"/>
       <w:lvlJc w:val="left"/>
       <w:pPr>
-        <w:ind w:left="2880" w:hanging="480"/>
+        <w:ind w:left="2880" w:hanging="360"/>
       </w:pPr>
     </w:lvl>
     <w:lvl w:ilvl="4">
@@ -13571,7 +13430,7 @@
       <w:lvlText w:val="%5)"/>
       <w:lvlJc w:val="left"/>
       <w:pPr>
-        <w:ind w:left="3600" w:hanging="480"/>
+        <w:ind w:left="3600" w:hanging="360"/>
       </w:pPr>
     </w:lvl>
     <w:lvl w:ilvl="5">
@@ -13580,7 +13439,7 @@
       <w:lvlText w:val="%6)"/>
       <w:lvlJc w:val="left"/>
       <w:pPr>
-        <w:ind w:left="4320" w:hanging="480"/>
+        <w:ind w:left="4320" w:hanging="360"/>
       </w:pPr>
     </w:lvl>
     <w:lvl w:ilvl="6">
@@ -13589,7 +13448,7 @@
       <w:lvlText w:val="%7)"/>
       <w:lvlJc w:val="left"/>
       <w:pPr>
-        <w:ind w:left="5040" w:hanging="480"/>
+        <w:ind w:left="5040" w:hanging="360"/>
       </w:pPr>
     </w:lvl>
     <w:lvl w:ilvl="7">
@@ -13598,7 +13457,7 @@
       <w:lvlText w:val="%8)"/>
       <w:lvlJc w:val="left"/>
       <w:pPr>
-        <w:ind w:left="5760" w:hanging="480"/>
+        <w:ind w:left="5760" w:hanging="360"/>
       </w:pPr>
     </w:lvl>
     <w:lvl w:ilvl="8">
@@ -13607,7 +13466,7 @@
       <w:lvlText w:val="%9)"/>
       <w:lvlJc w:val="left"/>
       <w:pPr>
-        <w:ind w:left="6480" w:hanging="480"/>
+        <w:ind w:left="6480" w:hanging="360"/>
       </w:pPr>
     </w:lvl>
   </w:abstractNum>
@@ -14099,10 +13958,10 @@
     <w:name w:val="Body Text"/>
     <w:basedOn w:val="Normal"/>
     <w:link w:val="BodyTextChar"/>
+    <w:qFormat/>
     <w:pPr>
       <w:spacing w:after="180" w:before="180"/>
     </w:pPr>
-    <w:qFormat/>
   </w:style>
   <w:style w:customStyle="1" w:styleId="FirstParagraph" w:type="paragraph">
     <w:name w:val="First Paragraph"/>
@@ -14122,36 +13981,69 @@
     <w:name w:val="Title"/>
     <w:basedOn w:val="Normal"/>
     <w:next w:val="BodyText"/>
+    <w:link w:val="TitleChar"/>
+    <w:uiPriority w:val="10"/>
     <w:qFormat/>
+    <w:rsid w:val="00A10FD9"/>
     <w:pPr>
-      <w:keepNext/>
-      <w:keepLines/>
-      <w:spacing w:after="240" w:before="480"/>
+      <w:spacing w:after="80" w:line="240" w:lineRule="auto"/>
+      <w:contextualSpacing/>
       <w:jc w:val="center"/>
     </w:pPr>
     <w:rPr>
       <w:rFonts w:asciiTheme="majorHAnsi" w:cstheme="majorBidi" w:eastAsiaTheme="majorEastAsia" w:hAnsiTheme="majorHAnsi"/>
-      <w:b/>
-      <w:bCs/>
-      <w:color w:themeColor="accent1" w:themeShade="B5" w:val="345A8A"/>
-      <w:sz w:val="36"/>
-      <w:szCs w:val="36"/>
+      <w:spacing w:val="-10"/>
+      <w:kern w:val="28"/>
+      <w:sz w:val="56"/>
+      <w:szCs w:val="56"/>
+    </w:rPr>
+  </w:style>
+  <w:style w:customStyle="1" w:styleId="TitleChar" w:type="character">
+    <w:name w:val="Title Char"/>
+    <w:basedOn w:val="DefaultParagraphFont"/>
+    <w:link w:val="Title"/>
+    <w:uiPriority w:val="10"/>
+    <w:rsid w:val="00A10FD9"/>
+    <w:rPr>
+      <w:rFonts w:asciiTheme="majorHAnsi" w:cstheme="majorBidi" w:eastAsiaTheme="majorEastAsia" w:hAnsiTheme="majorHAnsi"/>
+      <w:spacing w:val="-10"/>
+      <w:kern w:val="28"/>
+      <w:sz w:val="56"/>
+      <w:szCs w:val="56"/>
     </w:rPr>
   </w:style>
   <w:style w:styleId="Subtitle" w:type="paragraph">
     <w:name w:val="Subtitle"/>
     <w:basedOn w:val="Title"/>
     <w:next w:val="BodyText"/>
+    <w:link w:val="SubtitleChar"/>
+    <w:uiPriority w:val="11"/>
     <w:qFormat/>
+    <w:rsid w:val="00A10FD9"/>
     <w:pPr>
-      <w:keepNext/>
-      <w:keepLines/>
-      <w:spacing w:after="240" w:before="240"/>
-      <w:jc w:val="center"/>
+      <w:numPr>
+        <w:ilvl w:val="1"/>
+      </w:numPr>
     </w:pPr>
     <w:rPr>
-      <w:sz w:val="30"/>
-      <w:szCs w:val="30"/>
+      <w:rFonts w:cstheme="majorBidi" w:eastAsiaTheme="majorEastAsia"/>
+      <w:spacing w:val="15"/>
+      <w:sz w:val="28"/>
+      <w:szCs w:val="28"/>
+    </w:rPr>
+  </w:style>
+  <w:style w:customStyle="1" w:styleId="SubtitleChar" w:type="character">
+    <w:name w:val="Subtitle Char"/>
+    <w:basedOn w:val="DefaultParagraphFont"/>
+    <w:link w:val="Subtitle"/>
+    <w:uiPriority w:val="11"/>
+    <w:rsid w:val="00A10FD9"/>
+    <w:rPr>
+      <w:rFonts w:cstheme="majorBidi" w:eastAsiaTheme="majorEastAsia"/>
+      <w:color w:themeColor="text1" w:themeTint="A6" w:val="595959"/>
+      <w:spacing w:val="15"/>
+      <w:sz w:val="28"/>
+      <w:szCs w:val="28"/>
     </w:rPr>
   </w:style>
   <w:style w:customStyle="1" w:styleId="Author" w:type="paragraph">
@@ -14182,15 +14074,13 @@
     <w:pPr>
       <w:keepNext/>
       <w:keepLines/>
+      <w:spacing w:after="0" w:before="300"/>
       <w:jc w:val="center"/>
-      <w:spacing w:after="0" w:before="300"/>
     </w:pPr>
     <w:rPr>
+      <w:b/>
       <w:sz w:val="20"/>
       <w:szCs w:val="20"/>
-      <w:b/>
-      <w:color w:val="345A8A"/>
-      &gt;
     </w:rPr>
   </w:style>
   <w:style w:customStyle="1" w:styleId="Abstract" w:type="paragraph">
@@ -14217,191 +14107,321 @@
     <w:rPr/>
   </w:style>
   <w:style w:styleId="Heading1" w:type="paragraph">
-    <w:name w:val="Heading 1"/>
+    <w:name w:val="heading 1"/>
     <w:basedOn w:val="Normal"/>
     <w:next w:val="BodyText"/>
+    <w:link w:val="Heading1Char"/>
     <w:uiPriority w:val="9"/>
     <w:qFormat/>
+    <w:rsid w:val="00A10FD9"/>
     <w:pPr>
       <w:keepNext/>
       <w:keepLines/>
-      <w:spacing w:after="0" w:before="480"/>
+      <w:spacing w:after="80" w:before="360"/>
       <w:outlineLvl w:val="0"/>
     </w:pPr>
     <w:rPr>
       <w:rFonts w:asciiTheme="majorHAnsi" w:cstheme="majorBidi" w:eastAsiaTheme="majorEastAsia" w:hAnsiTheme="majorHAnsi"/>
-      <w:b/>
-      <w:bCs/>
-      <w:color w:themeColor="accent1" w:val="4F81BD"/>
+      <w:color w:themeColor="accent1" w:themeShade="BF" w:val="0F4761"/>
+      <w:sz w:val="40"/>
+      <w:szCs w:val="40"/>
+    </w:rPr>
+  </w:style>
+  <w:style w:styleId="Heading2" w:type="paragraph">
+    <w:name w:val="heading 2"/>
+    <w:basedOn w:val="Normal"/>
+    <w:next w:val="BodyText"/>
+    <w:link w:val="Heading2Char"/>
+    <w:uiPriority w:val="9"/>
+    <w:semiHidden/>
+    <w:unhideWhenUsed/>
+    <w:qFormat/>
+    <w:rsid w:val="00A10FD9"/>
+    <w:pPr>
+      <w:keepNext/>
+      <w:keepLines/>
+      <w:spacing w:after="80" w:before="160"/>
+      <w:outlineLvl w:val="1"/>
+    </w:pPr>
+    <w:rPr>
+      <w:rFonts w:asciiTheme="majorHAnsi" w:cstheme="majorBidi" w:eastAsiaTheme="majorEastAsia" w:hAnsiTheme="majorHAnsi"/>
+      <w:color w:themeColor="accent1" w:themeShade="BF" w:val="0F4761"/>
       <w:sz w:val="32"/>
       <w:szCs w:val="32"/>
     </w:rPr>
   </w:style>
-  <w:style w:styleId="Heading2" w:type="paragraph">
-    <w:name w:val="Heading 2"/>
+  <w:style w:styleId="Heading3" w:type="paragraph">
+    <w:name w:val="heading 3"/>
     <w:basedOn w:val="Normal"/>
     <w:next w:val="BodyText"/>
+    <w:link w:val="Heading3Char"/>
     <w:uiPriority w:val="9"/>
+    <w:semiHidden/>
     <w:unhideWhenUsed/>
     <w:qFormat/>
+    <w:rsid w:val="00A10FD9"/>
     <w:pPr>
       <w:keepNext/>
       <w:keepLines/>
-      <w:spacing w:after="0" w:before="200"/>
-      <w:outlineLvl w:val="1"/>
+      <w:spacing w:after="80" w:before="160"/>
+      <w:outlineLvl w:val="2"/>
     </w:pPr>
     <w:rPr>
-      <w:rFonts w:asciiTheme="majorHAnsi" w:cstheme="majorBidi" w:eastAsiaTheme="majorEastAsia" w:hAnsiTheme="majorHAnsi"/>
-      <w:b/>
-      <w:bCs/>
-      <w:color w:themeColor="accent1" w:val="4F81BD"/>
+      <w:rFonts w:cstheme="majorBidi" w:eastAsiaTheme="majorEastAsia"/>
+      <w:color w:themeColor="accent1" w:themeShade="BF" w:val="0F4761"/>
       <w:sz w:val="28"/>
       <w:szCs w:val="28"/>
     </w:rPr>
   </w:style>
-  <w:style w:styleId="Heading3" w:type="paragraph">
-    <w:name w:val="Heading 3"/>
+  <w:style w:styleId="Heading4" w:type="paragraph">
+    <w:name w:val="heading 4"/>
     <w:basedOn w:val="Normal"/>
     <w:next w:val="BodyText"/>
+    <w:link w:val="Heading4Char"/>
     <w:uiPriority w:val="9"/>
+    <w:semiHidden/>
     <w:unhideWhenUsed/>
     <w:qFormat/>
+    <w:rsid w:val="00A10FD9"/>
     <w:pPr>
       <w:keepNext/>
       <w:keepLines/>
-      <w:spacing w:after="0" w:before="200"/>
-      <w:outlineLvl w:val="2"/>
+      <w:spacing w:after="40" w:before="80"/>
+      <w:outlineLvl w:val="3"/>
     </w:pPr>
     <w:rPr>
-      <w:rFonts w:asciiTheme="majorHAnsi" w:cstheme="majorBidi" w:eastAsiaTheme="majorEastAsia" w:hAnsiTheme="majorHAnsi"/>
-      <w:b/>
-      <w:bCs/>
-      <w:color w:themeColor="accent1" w:val="4F81BD"/>
-      <w:sz w:val="24"/>
-      <w:szCs w:val="24"/>
+      <w:rFonts w:cstheme="majorBidi" w:eastAsiaTheme="majorEastAsia"/>
+      <w:i/>
+      <w:iCs/>
+      <w:color w:themeColor="accent1" w:themeShade="BF" w:val="0F4761"/>
     </w:rPr>
   </w:style>
-  <w:style w:styleId="Heading4" w:type="paragraph">
-    <w:name w:val="Heading 4"/>
+  <w:style w:styleId="Heading5" w:type="paragraph">
+    <w:name w:val="heading 5"/>
     <w:basedOn w:val="Normal"/>
     <w:next w:val="BodyText"/>
+    <w:link w:val="Heading5Char"/>
     <w:uiPriority w:val="9"/>
+    <w:semiHidden/>
     <w:unhideWhenUsed/>
     <w:qFormat/>
+    <w:rsid w:val="00A10FD9"/>
     <w:pPr>
       <w:keepNext/>
       <w:keepLines/>
-      <w:spacing w:after="0" w:before="200"/>
-      <w:outlineLvl w:val="3"/>
+      <w:spacing w:after="40" w:before="80"/>
+      <w:outlineLvl w:val="4"/>
     </w:pPr>
     <w:rPr>
-      <w:rFonts w:asciiTheme="majorHAnsi" w:cstheme="majorBidi" w:eastAsiaTheme="majorEastAsia" w:hAnsiTheme="majorHAnsi"/>
-      <w:i/>
-      <w:bCs/>
-      <w:color w:themeColor="accent1" w:val="4F81BD"/>
-      <w:sz w:val="24"/>
-      <w:szCs w:val="24"/>
+      <w:rFonts w:cstheme="majorBidi" w:eastAsiaTheme="majorEastAsia"/>
+      <w:color w:themeColor="accent1" w:themeShade="BF" w:val="0F4761"/>
     </w:rPr>
   </w:style>
-  <w:style w:styleId="Heading5" w:type="paragraph">
-    <w:name w:val="Heading 5"/>
+  <w:style w:styleId="Heading6" w:type="paragraph">
+    <w:name w:val="heading 6"/>
     <w:basedOn w:val="Normal"/>
     <w:next w:val="BodyText"/>
+    <w:link w:val="Heading6Char"/>
     <w:uiPriority w:val="9"/>
+    <w:semiHidden/>
     <w:unhideWhenUsed/>
     <w:qFormat/>
+    <w:rsid w:val="00A10FD9"/>
     <w:pPr>
       <w:keepNext/>
       <w:keepLines/>
-      <w:spacing w:after="0" w:before="200"/>
-      <w:outlineLvl w:val="4"/>
+      <w:spacing w:after="0" w:before="40"/>
+      <w:outlineLvl w:val="5"/>
     </w:pPr>
     <w:rPr>
-      <w:rFonts w:asciiTheme="majorHAnsi" w:cstheme="majorBidi" w:eastAsiaTheme="majorEastAsia" w:hAnsiTheme="majorHAnsi"/>
+      <w:rFonts w:cstheme="majorBidi" w:eastAsiaTheme="majorEastAsia"/>
+      <w:i/>
       <w:iCs/>
-      <w:color w:themeColor="accent1" w:val="4F81BD"/>
-      <w:sz w:val="24"/>
-      <w:szCs w:val="24"/>
+      <w:color w:themeColor="text1" w:themeTint="A6" w:val="595959"/>
     </w:rPr>
   </w:style>
-  <w:style w:styleId="Heading6" w:type="paragraph">
-    <w:name w:val="Heading 6"/>
+  <w:style w:styleId="Heading7" w:type="paragraph">
+    <w:name w:val="heading 7"/>
     <w:basedOn w:val="Normal"/>
     <w:next w:val="BodyText"/>
+    <w:link w:val="Heading7Char"/>
     <w:uiPriority w:val="9"/>
+    <w:semiHidden/>
     <w:unhideWhenUsed/>
     <w:qFormat/>
+    <w:rsid w:val="00A10FD9"/>
     <w:pPr>
       <w:keepNext/>
       <w:keepLines/>
-      <w:spacing w:after="0" w:before="200"/>
-      <w:outlineLvl w:val="5"/>
+      <w:spacing w:after="0" w:before="40"/>
+      <w:outlineLvl w:val="6"/>
     </w:pPr>
     <w:rPr>
-      <w:rFonts w:asciiTheme="majorHAnsi" w:cstheme="majorBidi" w:eastAsiaTheme="majorEastAsia" w:hAnsiTheme="majorHAnsi"/>
-      <w:color w:themeColor="accent1" w:val="4F81BD"/>
-      <w:sz w:val="24"/>
-      <w:szCs w:val="24"/>
+      <w:rFonts w:cstheme="majorBidi" w:eastAsiaTheme="majorEastAsia"/>
+      <w:color w:themeColor="text1" w:themeTint="A6" w:val="595959"/>
     </w:rPr>
   </w:style>
-  <w:style w:styleId="Heading7" w:type="paragraph">
-    <w:name w:val="Heading 7"/>
+  <w:style w:styleId="Heading8" w:type="paragraph">
+    <w:name w:val="heading 8"/>
     <w:basedOn w:val="Normal"/>
     <w:next w:val="BodyText"/>
+    <w:link w:val="Heading8Char"/>
     <w:uiPriority w:val="9"/>
+    <w:semiHidden/>
     <w:unhideWhenUsed/>
     <w:qFormat/>
+    <w:rsid w:val="00A10FD9"/>
     <w:pPr>
       <w:keepNext/>
       <w:keepLines/>
-      <w:spacing w:after="0" w:before="200"/>
-      <w:outlineLvl w:val="6"/>
+      <w:spacing w:after="0"/>
+      <w:outlineLvl w:val="7"/>
     </w:pPr>
     <w:rPr>
-      <w:rFonts w:asciiTheme="majorHAnsi" w:cstheme="majorBidi" w:eastAsiaTheme="majorEastAsia" w:hAnsiTheme="majorHAnsi"/>
-      <w:color w:themeColor="accent1" w:val="4F81BD"/>
-      <w:sz w:val="24"/>
-      <w:szCs w:val="24"/>
+      <w:rFonts w:cstheme="majorBidi" w:eastAsiaTheme="majorEastAsia"/>
+      <w:i/>
+      <w:iCs/>
+      <w:color w:themeColor="text1" w:themeTint="D8" w:val="272727"/>
     </w:rPr>
   </w:style>
-  <w:style w:styleId="Heading8" w:type="paragraph">
-    <w:name w:val="Heading 8"/>
+  <w:style w:styleId="Heading9" w:type="paragraph">
+    <w:name w:val="heading 9"/>
     <w:basedOn w:val="Normal"/>
     <w:next w:val="BodyText"/>
+    <w:link w:val="Heading9Char"/>
     <w:uiPriority w:val="9"/>
+    <w:semiHidden/>
     <w:unhideWhenUsed/>
     <w:qFormat/>
+    <w:rsid w:val="00A10FD9"/>
     <w:pPr>
       <w:keepNext/>
       <w:keepLines/>
-      <w:spacing w:after="0" w:before="200"/>
-      <w:outlineLvl w:val="7"/>
-    </w:pPr>
-    <w:rPr>
-      <w:rFonts w:asciiTheme="majorHAnsi" w:cstheme="majorBidi" w:eastAsiaTheme="majorEastAsia" w:hAnsiTheme="majorHAnsi"/>
-      <w:color w:themeColor="accent1" w:val="4F81BD"/>
-      <w:sz w:val="24"/>
-      <w:szCs w:val="24"/>
-    </w:rPr>
-  </w:style>
-  <w:style w:styleId="Heading9" w:type="paragraph">
-    <w:name w:val="Heading 9"/>
-    <w:basedOn w:val="Normal"/>
-    <w:next w:val="BodyText"/>
-    <w:uiPriority w:val="9"/>
-    <w:unhideWhenUsed/>
-    <w:qFormat/>
-    <w:pPr>
-      <w:keepNext/>
-      <w:keepLines/>
-      <w:spacing w:after="0" w:before="200"/>
+      <w:spacing w:after="0"/>
       <w:outlineLvl w:val="8"/>
     </w:pPr>
     <w:rPr>
+      <w:rFonts w:cstheme="majorBidi" w:eastAsiaTheme="majorEastAsia"/>
+      <w:color w:themeColor="text1" w:themeTint="D8" w:val="272727"/>
+    </w:rPr>
+  </w:style>
+  <w:style w:customStyle="1" w:styleId="Heading1Char" w:type="character">
+    <w:name w:val="Heading 1 Char"/>
+    <w:basedOn w:val="DefaultParagraphFont"/>
+    <w:link w:val="Heading1"/>
+    <w:uiPriority w:val="9"/>
+    <w:rsid w:val="00A10FD9"/>
+    <w:rPr>
       <w:rFonts w:asciiTheme="majorHAnsi" w:cstheme="majorBidi" w:eastAsiaTheme="majorEastAsia" w:hAnsiTheme="majorHAnsi"/>
-      <w:color w:themeColor="accent1" w:val="4F81BD"/>
-      <w:sz w:val="24"/>
-      <w:szCs w:val="24"/>
+      <w:color w:themeColor="accent1" w:themeShade="BF" w:val="0F4761"/>
+      <w:sz w:val="40"/>
+      <w:szCs w:val="40"/>
+    </w:rPr>
+  </w:style>
+  <w:style w:customStyle="1" w:styleId="Heading2Char" w:type="character">
+    <w:name w:val="Heading 2 Char"/>
+    <w:basedOn w:val="DefaultParagraphFont"/>
+    <w:link w:val="Heading2"/>
+    <w:uiPriority w:val="9"/>
+    <w:semiHidden/>
+    <w:rsid w:val="00A10FD9"/>
+    <w:rPr>
+      <w:rFonts w:asciiTheme="majorHAnsi" w:cstheme="majorBidi" w:eastAsiaTheme="majorEastAsia" w:hAnsiTheme="majorHAnsi"/>
+      <w:color w:themeColor="accent1" w:themeShade="BF" w:val="0F4761"/>
+      <w:sz w:val="32"/>
+      <w:szCs w:val="32"/>
+    </w:rPr>
+  </w:style>
+  <w:style w:customStyle="1" w:styleId="Heading3Char" w:type="character">
+    <w:name w:val="Heading 3 Char"/>
+    <w:basedOn w:val="DefaultParagraphFont"/>
+    <w:link w:val="Heading3"/>
+    <w:uiPriority w:val="9"/>
+    <w:semiHidden/>
+    <w:rsid w:val="00A10FD9"/>
+    <w:rPr>
+      <w:rFonts w:cstheme="majorBidi" w:eastAsiaTheme="majorEastAsia"/>
+      <w:color w:themeColor="accent1" w:themeShade="BF" w:val="0F4761"/>
+      <w:sz w:val="28"/>
+      <w:szCs w:val="28"/>
+    </w:rPr>
+  </w:style>
+  <w:style w:customStyle="1" w:styleId="Heading4Char" w:type="character">
+    <w:name w:val="Heading 4 Char"/>
+    <w:basedOn w:val="DefaultParagraphFont"/>
+    <w:link w:val="Heading4"/>
+    <w:uiPriority w:val="9"/>
+    <w:semiHidden/>
+    <w:rsid w:val="00A10FD9"/>
+    <w:rPr>
+      <w:rFonts w:cstheme="majorBidi" w:eastAsiaTheme="majorEastAsia"/>
+      <w:i/>
+      <w:iCs/>
+      <w:color w:themeColor="accent1" w:themeShade="BF" w:val="0F4761"/>
+    </w:rPr>
+  </w:style>
+  <w:style w:customStyle="1" w:styleId="Heading5Char" w:type="character">
+    <w:name w:val="Heading 5 Char"/>
+    <w:basedOn w:val="DefaultParagraphFont"/>
+    <w:link w:val="Heading5"/>
+    <w:uiPriority w:val="9"/>
+    <w:semiHidden/>
+    <w:rsid w:val="00A10FD9"/>
+    <w:rPr>
+      <w:rFonts w:cstheme="majorBidi" w:eastAsiaTheme="majorEastAsia"/>
+      <w:color w:themeColor="accent1" w:themeShade="BF" w:val="0F4761"/>
+    </w:rPr>
+  </w:style>
+  <w:style w:customStyle="1" w:styleId="Heading6Char" w:type="character">
+    <w:name w:val="Heading 6 Char"/>
+    <w:basedOn w:val="DefaultParagraphFont"/>
+    <w:link w:val="Heading6"/>
+    <w:uiPriority w:val="9"/>
+    <w:semiHidden/>
+    <w:rsid w:val="00A10FD9"/>
+    <w:rPr>
+      <w:rFonts w:cstheme="majorBidi" w:eastAsiaTheme="majorEastAsia"/>
+      <w:i/>
+      <w:iCs/>
+      <w:color w:themeColor="text1" w:themeTint="A6" w:val="595959"/>
+    </w:rPr>
+  </w:style>
+  <w:style w:customStyle="1" w:styleId="Heading7Char" w:type="character">
+    <w:name w:val="Heading 7 Char"/>
+    <w:basedOn w:val="DefaultParagraphFont"/>
+    <w:link w:val="Heading7"/>
+    <w:uiPriority w:val="9"/>
+    <w:semiHidden/>
+    <w:rsid w:val="00A10FD9"/>
+    <w:rPr>
+      <w:rFonts w:cstheme="majorBidi" w:eastAsiaTheme="majorEastAsia"/>
+      <w:color w:themeColor="text1" w:themeTint="A6" w:val="595959"/>
+    </w:rPr>
+  </w:style>
+  <w:style w:customStyle="1" w:styleId="Heading8Char" w:type="character">
+    <w:name w:val="Heading 8 Char"/>
+    <w:basedOn w:val="DefaultParagraphFont"/>
+    <w:link w:val="Heading8"/>
+    <w:uiPriority w:val="9"/>
+    <w:semiHidden/>
+    <w:rsid w:val="00A10FD9"/>
+    <w:rPr>
+      <w:rFonts w:cstheme="majorBidi" w:eastAsiaTheme="majorEastAsia"/>
+      <w:i/>
+      <w:iCs/>
+      <w:color w:themeColor="text1" w:themeTint="D8" w:val="272727"/>
+    </w:rPr>
+  </w:style>
+  <w:style w:customStyle="1" w:styleId="Heading9Char" w:type="character">
+    <w:name w:val="Heading 9 Char"/>
+    <w:basedOn w:val="DefaultParagraphFont"/>
+    <w:link w:val="Heading9"/>
+    <w:uiPriority w:val="9"/>
+    <w:semiHidden/>
+    <w:rsid w:val="00A10FD9"/>
+    <w:rPr>
+      <w:rFonts w:cstheme="majorBidi" w:eastAsiaTheme="majorEastAsia"/>
+      <w:color w:themeColor="text1" w:themeTint="D8" w:val="272727"/>
     </w:rPr>
   </w:style>
   <w:style w:styleId="BlockText" w:type="paragraph">
@@ -14426,8 +14446,8 @@
   </w:style>
   <w:style w:styleId="FootnoteBlockText" w:type="paragraph">
     <w:name w:val="Footnote Block Text"/>
-    <w:basedOn w:val="Footnote Text"/>
-    <w:next w:val="Footnote Text"/>
+    <w:basedOn w:val="FootnoteText"/>
+    <w:next w:val="FootnoteText"/>
     <w:uiPriority w:val="9"/>
     <w:unhideWhenUsed/>
     <w:qFormat/>
@@ -14465,10 +14485,10 @@
         <w:jc w:val="left"/>
       </w:trPr>
       <w:tcPr>
-        <w:vAlign w:val="bottom"/>
         <w:tcBorders>
           <w:bottom w:val="single"/>
         </w:tcBorders>
+        <w:vAlign w:val="bottom"/>
       </w:tcPr>
     </w:tblStylePr>
   </w:style>
@@ -14584,6 +14604,7 @@
     <w:name w:val="KeywordTok"/>
     <w:basedOn w:val="VerbatimChar"/>
     <w:rPr>
+      <w:b/>
       <w:color w:val="003b4f"/>
       <w:shd w:val="clear" w:fill="f1f3f5"/>
     </w:rPr>
@@ -14688,9 +14709,9 @@
     <w:name w:val="DocumentationTok"/>
     <w:basedOn w:val="VerbatimChar"/>
     <w:rPr>
+      <w:i/>
       <w:color w:val="5e5e5e"/>
       <w:shd w:val="clear" w:fill="f1f3f5"/>
-      <w:i/>
     </w:rPr>
   </w:style>
   <w:style w:type="character" w:customStyle="1" w:styleId="AnnotationTok">
@@ -14705,9 +14726,9 @@
     <w:name w:val="CommentVarTok"/>
     <w:basedOn w:val="VerbatimChar"/>
     <w:rPr>
+      <w:i/>
       <w:color w:val="5e5e5e"/>
       <w:shd w:val="clear" w:fill="f1f3f5"/>
-      <w:i/>
     </w:rPr>
   </w:style>
   <w:style w:type="character" w:customStyle="1" w:styleId="OtherTok">
@@ -14738,6 +14759,7 @@
     <w:name w:val="ControlFlowTok"/>
     <w:basedOn w:val="VerbatimChar"/>
     <w:rPr>
+      <w:b/>
       <w:color w:val="003b4f"/>
       <w:shd w:val="clear" w:fill="f1f3f5"/>
     </w:rPr>
@@ -14802,9 +14824,9 @@
     <w:name w:val="WarningTok"/>
     <w:basedOn w:val="VerbatimChar"/>
     <w:rPr>
+      <w:i/>
       <w:color w:val="5e5e5e"/>
       <w:shd w:val="clear" w:fill="f1f3f5"/>
-      <w:i/>
     </w:rPr>
   </w:style>
   <w:style w:type="character" w:customStyle="1" w:styleId="AlertTok">
@@ -14845,44 +14867,44 @@
         <a:sysClr val="window" lastClr="FFFFFF"/>
       </a:lt1>
       <a:dk2>
-        <a:srgbClr val="1F497D"/>
+        <a:srgbClr val="0E2841"/>
       </a:dk2>
       <a:lt2>
-        <a:srgbClr val="EEECE1"/>
+        <a:srgbClr val="E8E8E8"/>
       </a:lt2>
       <a:accent1>
-        <a:srgbClr val="4F81BD"/>
+        <a:srgbClr val="156082"/>
       </a:accent1>
       <a:accent2>
-        <a:srgbClr val="C0504D"/>
+        <a:srgbClr val="E97132"/>
       </a:accent2>
       <a:accent3>
-        <a:srgbClr val="9BBB59"/>
+        <a:srgbClr val="196B24"/>
       </a:accent3>
       <a:accent4>
-        <a:srgbClr val="8064A2"/>
+        <a:srgbClr val="0F9ED5"/>
       </a:accent4>
       <a:accent5>
-        <a:srgbClr val="4BACC6"/>
+        <a:srgbClr val="A02B93"/>
       </a:accent5>
       <a:accent6>
-        <a:srgbClr val="F79646"/>
+        <a:srgbClr val="4EA72E"/>
       </a:accent6>
       <a:hlink>
-        <a:srgbClr val="0000FF"/>
+        <a:srgbClr val="467886"/>
       </a:hlink>
       <a:folHlink>
-        <a:srgbClr val="800080"/>
+        <a:srgbClr val="96607D"/>
       </a:folHlink>
     </a:clrScheme>
     <a:fontScheme name="Office">
       <a:majorFont>
-        <a:latin typeface="Calibri"/>
+        <a:latin typeface="Aptos Display" panose="02110004020202020204"/>
         <a:ea typeface=""/>
         <a:cs typeface=""/>
-        <a:font script="Jpan" typeface="ＭＳ ゴシック"/>
+        <a:font script="Jpan" typeface="游ゴシック Light"/>
         <a:font script="Hang" typeface="맑은 고딕"/>
-        <a:font script="Hans" typeface="宋体"/>
+        <a:font script="Hans" typeface="等线 Light"/>
         <a:font script="Hant" typeface="新細明體"/>
         <a:font script="Arab" typeface="Times New Roman"/>
         <a:font script="Hebr" typeface="Times New Roman"/>
@@ -14909,14 +14931,32 @@
         <a:font script="Mong" typeface="Mongolian Baiti"/>
         <a:font script="Viet" typeface="Times New Roman"/>
         <a:font script="Uigh" typeface="Microsoft Uighur"/>
+        <a:font script="Geor" typeface="Sylfaen"/>
+        <a:font script="Armn" typeface="Arial"/>
+        <a:font script="Bugi" typeface="Leelawadee UI"/>
+        <a:font script="Bopo" typeface="Microsoft JhengHei"/>
+        <a:font script="Java" typeface="Javanese Text"/>
+        <a:font script="Lisu" typeface="Segoe UI"/>
+        <a:font script="Mymr" typeface="Myanmar Text"/>
+        <a:font script="Nkoo" typeface="Ebrima"/>
+        <a:font script="Olck" typeface="Nirmala UI"/>
+        <a:font script="Osma" typeface="Ebrima"/>
+        <a:font script="Phag" typeface="Phagspa"/>
+        <a:font script="Syrn" typeface="Estrangelo Edessa"/>
+        <a:font script="Syrj" typeface="Estrangelo Edessa"/>
+        <a:font script="Syre" typeface="Estrangelo Edessa"/>
+        <a:font script="Sora" typeface="Nirmala UI"/>
+        <a:font script="Tale" typeface="Microsoft Tai Le"/>
+        <a:font script="Talu" typeface="Microsoft New Tai Lue"/>
+        <a:font script="Tfng" typeface="Ebrima"/>
       </a:majorFont>
       <a:minorFont>
-        <a:latin typeface="Cambria"/>
+        <a:latin typeface="Aptos" panose="02110004020202020204"/>
         <a:ea typeface=""/>
         <a:cs typeface=""/>
-        <a:font script="Jpan" typeface="ＭＳ 明朝"/>
+        <a:font script="Jpan" typeface="游明朝"/>
         <a:font script="Hang" typeface="맑은 고딕"/>
-        <a:font script="Hans" typeface="宋体"/>
+        <a:font script="Hans" typeface="等线"/>
         <a:font script="Hant" typeface="新細明體"/>
         <a:font script="Arab" typeface="Arial"/>
         <a:font script="Hebr" typeface="Arial"/>
@@ -14943,6 +14983,24 @@
         <a:font script="Mong" typeface="Mongolian Baiti"/>
         <a:font script="Viet" typeface="Arial"/>
         <a:font script="Uigh" typeface="Microsoft Uighur"/>
+        <a:font script="Geor" typeface="Sylfaen"/>
+        <a:font script="Armn" typeface="Arial"/>
+        <a:font script="Bugi" typeface="Leelawadee UI"/>
+        <a:font script="Bopo" typeface="Microsoft JhengHei"/>
+        <a:font script="Java" typeface="Javanese Text"/>
+        <a:font script="Lisu" typeface="Segoe UI"/>
+        <a:font script="Mymr" typeface="Myanmar Text"/>
+        <a:font script="Nkoo" typeface="Ebrima"/>
+        <a:font script="Olck" typeface="Nirmala UI"/>
+        <a:font script="Osma" typeface="Ebrima"/>
+        <a:font script="Phag" typeface="Phagspa"/>
+        <a:font script="Syrn" typeface="Estrangelo Edessa"/>
+        <a:font script="Syrj" typeface="Estrangelo Edessa"/>
+        <a:font script="Syre" typeface="Estrangelo Edessa"/>
+        <a:font script="Sora" typeface="Nirmala UI"/>
+        <a:font script="Tale" typeface="Microsoft Tai Le"/>
+        <a:font script="Talu" typeface="Microsoft New Tai Lue"/>
+        <a:font script="Tfng" typeface="Ebrima"/>
       </a:minorFont>
     </a:fontScheme>
     <a:fmtScheme name="Office">
@@ -14954,200 +15012,141 @@
           <a:gsLst>
             <a:gs pos="0">
               <a:schemeClr val="phClr">
-                <a:tint val="50000"/>
-                <a:satMod val="300000"/>
+                <a:lumMod val="110000"/>
+                <a:satMod val="105000"/>
+                <a:tint val="67000"/>
               </a:schemeClr>
             </a:gs>
-            <a:gs pos="35000">
+            <a:gs pos="50000">
               <a:schemeClr val="phClr">
-                <a:tint val="37000"/>
-                <a:satMod val="300000"/>
+                <a:lumMod val="105000"/>
+                <a:satMod val="103000"/>
+                <a:tint val="73000"/>
               </a:schemeClr>
             </a:gs>
             <a:gs pos="100000">
               <a:schemeClr val="phClr">
-                <a:tint val="15000"/>
-                <a:satMod val="350000"/>
+                <a:lumMod val="105000"/>
+                <a:satMod val="109000"/>
+                <a:tint val="81000"/>
               </a:schemeClr>
             </a:gs>
           </a:gsLst>
-          <a:lin ang="16200000" scaled="1"/>
+          <a:lin ang="5400000" scaled="0"/>
         </a:gradFill>
         <a:gradFill rotWithShape="1">
           <a:gsLst>
             <a:gs pos="0">
               <a:schemeClr val="phClr">
-                <a:tint val="100000"/>
+                <a:satMod val="103000"/>
+                <a:lumMod val="102000"/>
+                <a:tint val="94000"/>
+              </a:schemeClr>
+            </a:gs>
+            <a:gs pos="50000">
+              <a:schemeClr val="phClr">
+                <a:satMod val="110000"/>
+                <a:lumMod val="100000"/>
                 <a:shade val="100000"/>
-                <a:satMod val="130000"/>
               </a:schemeClr>
             </a:gs>
             <a:gs pos="100000">
               <a:schemeClr val="phClr">
-                <a:tint val="50000"/>
-                <a:shade val="100000"/>
-                <a:satMod val="350000"/>
+                <a:lumMod val="99000"/>
+                <a:satMod val="120000"/>
+                <a:shade val="78000"/>
               </a:schemeClr>
             </a:gs>
           </a:gsLst>
-          <a:lin ang="16200000" scaled="0"/>
+          <a:lin ang="5400000" scaled="0"/>
         </a:gradFill>
       </a:fillStyleLst>
       <a:lnStyleLst>
-        <a:ln w="9525" cap="flat" cmpd="sng" algn="ctr">
-          <a:solidFill>
-            <a:schemeClr val="phClr">
-              <a:shade val="95000"/>
-              <a:satMod val="105000"/>
-            </a:schemeClr>
-          </a:solidFill>
-          <a:prstDash val="solid"/>
-        </a:ln>
-        <a:ln w="25400" cap="flat" cmpd="sng" algn="ctr">
+        <a:ln w="6350" cap="flat" cmpd="sng" algn="ctr">
           <a:solidFill>
             <a:schemeClr val="phClr"/>
           </a:solidFill>
           <a:prstDash val="solid"/>
+          <a:miter lim="800000"/>
         </a:ln>
-        <a:ln w="38100" cap="flat" cmpd="sng" algn="ctr">
+        <a:ln w="12700" cap="flat" cmpd="sng" algn="ctr">
           <a:solidFill>
             <a:schemeClr val="phClr"/>
           </a:solidFill>
           <a:prstDash val="solid"/>
+          <a:miter lim="800000"/>
+        </a:ln>
+        <a:ln w="19050" cap="flat" cmpd="sng" algn="ctr">
+          <a:solidFill>
+            <a:schemeClr val="phClr"/>
+          </a:solidFill>
+          <a:prstDash val="solid"/>
+          <a:miter lim="800000"/>
         </a:ln>
       </a:lnStyleLst>
       <a:effectStyleLst>
         <a:effectStyle>
+          <a:effectLst/>
+        </a:effectStyle>
+        <a:effectStyle>
+          <a:effectLst/>
+        </a:effectStyle>
+        <a:effectStyle>
           <a:effectLst>
-            <a:outerShdw blurRad="40000" dist="20000" dir="5400000" rotWithShape="0">
+            <a:outerShdw blurRad="57150" dist="19050" dir="5400000" algn="ctr" rotWithShape="0">
               <a:srgbClr val="000000">
-                <a:alpha val="38000"/>
+                <a:alpha val="63000"/>
               </a:srgbClr>
             </a:outerShdw>
           </a:effectLst>
-        </a:effectStyle>
-        <a:effectStyle>
-          <a:effectLst>
-            <a:outerShdw blurRad="40000" dist="23000" dir="5400000" rotWithShape="0">
-              <a:srgbClr val="000000">
-                <a:alpha val="35000"/>
-              </a:srgbClr>
-            </a:outerShdw>
-          </a:effectLst>
-        </a:effectStyle>
-        <a:effectStyle>
-          <a:effectLst>
-            <a:outerShdw blurRad="40000" dist="23000" dir="5400000" rotWithShape="0">
-              <a:srgbClr val="000000">
-                <a:alpha val="35000"/>
-              </a:srgbClr>
-            </a:outerShdw>
-          </a:effectLst>
-          <a:scene3d>
-            <a:camera prst="orthographicFront">
-              <a:rot lat="0" lon="0" rev="0"/>
-            </a:camera>
-            <a:lightRig rig="threePt" dir="t">
-              <a:rot lat="0" lon="0" rev="1200000"/>
-            </a:lightRig>
-          </a:scene3d>
-          <a:sp3d>
-            <a:bevelT w="63500" h="25400"/>
-          </a:sp3d>
         </a:effectStyle>
       </a:effectStyleLst>
       <a:bgFillStyleLst>
         <a:solidFill>
           <a:schemeClr val="phClr"/>
         </a:solidFill>
+        <a:solidFill>
+          <a:schemeClr val="phClr">
+            <a:tint val="95000"/>
+            <a:satMod val="170000"/>
+          </a:schemeClr>
+        </a:solidFill>
         <a:gradFill rotWithShape="1">
           <a:gsLst>
             <a:gs pos="0">
               <a:schemeClr val="phClr">
-                <a:tint val="40000"/>
-                <a:satMod val="350000"/>
+                <a:tint val="93000"/>
+                <a:satMod val="150000"/>
+                <a:shade val="98000"/>
+                <a:lumMod val="102000"/>
               </a:schemeClr>
             </a:gs>
-            <a:gs pos="40000">
+            <a:gs pos="50000">
               <a:schemeClr val="phClr">
-                <a:tint val="45000"/>
-                <a:shade val="99000"/>
-                <a:satMod val="350000"/>
+                <a:tint val="98000"/>
+                <a:satMod val="130000"/>
+                <a:shade val="90000"/>
+                <a:lumMod val="103000"/>
               </a:schemeClr>
             </a:gs>
             <a:gs pos="100000">
               <a:schemeClr val="phClr">
-                <a:shade val="20000"/>
-                <a:satMod val="255000"/>
+                <a:shade val="63000"/>
+                <a:satMod val="120000"/>
               </a:schemeClr>
             </a:gs>
           </a:gsLst>
-          <a:path path="circle">
-            <a:fillToRect l="50000" t="-80000" r="50000" b="180000"/>
-          </a:path>
-        </a:gradFill>
-        <a:gradFill rotWithShape="1">
-          <a:gsLst>
-            <a:gs pos="0">
-              <a:schemeClr val="phClr">
-                <a:tint val="80000"/>
-                <a:satMod val="300000"/>
-              </a:schemeClr>
-            </a:gs>
-            <a:gs pos="100000">
-              <a:schemeClr val="phClr">
-                <a:shade val="30000"/>
-                <a:satMod val="200000"/>
-              </a:schemeClr>
-            </a:gs>
-          </a:gsLst>
-          <a:path path="circle">
-            <a:fillToRect l="50000" t="50000" r="50000" b="50000"/>
-          </a:path>
+          <a:lin ang="5400000" scaled="0"/>
         </a:gradFill>
       </a:bgFillStyleLst>
     </a:fmtScheme>
   </a:themeElements>
-  <a:objectDefaults>
-    <a:spDef>
-      <a:spPr/>
-      <a:bodyPr/>
-      <a:lstStyle/>
-      <a:style>
-        <a:lnRef idx="1">
-          <a:schemeClr val="accent1"/>
-        </a:lnRef>
-        <a:fillRef idx="3">
-          <a:schemeClr val="accent1"/>
-        </a:fillRef>
-        <a:effectRef idx="2">
-          <a:schemeClr val="accent1"/>
-        </a:effectRef>
-        <a:fontRef idx="minor">
-          <a:schemeClr val="lt1"/>
-        </a:fontRef>
-      </a:style>
-    </a:spDef>
-    <a:lnDef>
-      <a:spPr/>
-      <a:bodyPr/>
-      <a:lstStyle/>
-      <a:style>
-        <a:lnRef idx="2">
-          <a:schemeClr val="accent1"/>
-        </a:lnRef>
-        <a:fillRef idx="0">
-          <a:schemeClr val="accent1"/>
-        </a:fillRef>
-        <a:effectRef idx="1">
-          <a:schemeClr val="accent1"/>
-        </a:effectRef>
-        <a:fontRef idx="minor">
-          <a:schemeClr val="tx1"/>
-        </a:fontRef>
-      </a:style>
-    </a:lnDef>
-  </a:objectDefaults>
+  <a:objectDefaults/>
   <a:extraClrSchemeLst/>
+  <a:extLst>
+    <a:ext uri="{05A4C25C-085E-4340-85A3-A5531E510DB2}">
+      <thm15:themeFamily xmlns:thm15="http://schemas.microsoft.com/office/thememl/2012/main" name="Office Theme" id="{2E142A2C-CD16-42D6-873A-C26D2A0506FA}" vid="{1BDDFF52-6CD6-40A5-AB3C-68EB2F1E4D0A}"/>
+    </a:ext>
+  </a:extLst>
 </a:theme>
 </file>
</xml_diff>